<commit_message>
Update notes and add new assignments
</commit_message>
<xml_diff>
--- a/TYBCA/Java/Java programming class notes.docx
+++ b/TYBCA/Java/Java programming class notes.docx
@@ -1,6 +1,6 @@
 
 <file path=word/document.xml><?xml version="1.0" encoding="utf-8"?>
-<w:document xmlns:wpc="http://schemas.microsoft.com/office/word/2010/wordprocessingCanvas" xmlns:cx="http://schemas.microsoft.com/office/drawing/2014/chartex" xmlns:cx1="http://schemas.microsoft.com/office/drawing/2015/9/8/chartex" xmlns:cx2="http://schemas.microsoft.com/office/drawing/2015/10/21/chartex" xmlns:cx3="http://schemas.microsoft.com/office/drawing/2016/5/9/chartex" xmlns:cx4="http://schemas.microsoft.com/office/drawing/2016/5/10/chartex" xmlns:cx5="http://schemas.microsoft.com/office/drawing/2016/5/11/chartex" xmlns:cx6="http://schemas.microsoft.com/office/drawing/2016/5/12/chartex" xmlns:cx7="http://schemas.microsoft.com/office/drawing/2016/5/13/chartex" xmlns:cx8="http://schemas.microsoft.com/office/drawing/2016/5/14/chartex" xmlns:mc="http://schemas.openxmlformats.org/markup-compatibility/2006" xmlns:aink="http://schemas.microsoft.com/office/drawing/2016/ink" xmlns:am3d="http://schemas.microsoft.com/office/drawing/2017/model3d" xmlns:o="urn:schemas-microsoft-com:office:office" xmlns:oel="http://schemas.microsoft.com/office/2019/extlst" xmlns:r="http://schemas.openxmlformats.org/officeDocument/2006/relationships" xmlns:m="http://schemas.openxmlformats.org/officeDocument/2006/math" xmlns:v="urn:schemas-microsoft-com:vml" xmlns:wp14="http://schemas.microsoft.com/office/word/2010/wordprocessingDrawing" xmlns:wp="http://schemas.openxmlformats.org/drawingml/2006/wordprocessingDrawing" xmlns:w10="urn:schemas-microsoft-com:office:word" xmlns:w="http://schemas.openxmlformats.org/wordprocessingml/2006/main" xmlns:w14="http://schemas.microsoft.com/office/word/2010/wordml" xmlns:w15="http://schemas.microsoft.com/office/word/2012/wordml" xmlns:w16cei="http://schemas.microsoft.com/office/word/2026/wordml/cei" xmlns:w16cex="http://schemas.microsoft.com/office/word/2018/wordml/cex" xmlns:w16cid="http://schemas.microsoft.com/office/word/2016/wordml/cid" xmlns:w16="http://schemas.microsoft.com/office/word/2018/wordml" xmlns:w16du="http://schemas.microsoft.com/office/word/2023/wordml/word16du" xmlns:w16sdtdh="http://schemas.microsoft.com/office/word/2020/wordml/sdtdatahash" xmlns:w16sdtfl="http://schemas.microsoft.com/office/word/2024/wordml/sdtformatlock" xmlns:w16se="http://schemas.microsoft.com/office/word/2015/wordml/symex" xmlns:wpg="http://schemas.microsoft.com/office/word/2010/wordprocessingGroup" xmlns:wpi="http://schemas.microsoft.com/office/word/2010/wordprocessingInk" xmlns:wne="http://schemas.microsoft.com/office/word/2006/wordml" xmlns:wps="http://schemas.microsoft.com/office/word/2010/wordprocessingShape" mc:Ignorable="w14 w15 w16se w16cid w16 w16cex w16sdtdh w16sdtfl w16du wp14">
+<w:document xmlns:wpc="http://schemas.microsoft.com/office/word/2010/wordprocessingCanvas" xmlns:cx="http://schemas.microsoft.com/office/drawing/2014/chartex" xmlns:cx1="http://schemas.microsoft.com/office/drawing/2015/9/8/chartex" xmlns:cx2="http://schemas.microsoft.com/office/drawing/2015/10/21/chartex" xmlns:cx3="http://schemas.microsoft.com/office/drawing/2016/5/9/chartex" xmlns:cx4="http://schemas.microsoft.com/office/drawing/2016/5/10/chartex" xmlns:cx5="http://schemas.microsoft.com/office/drawing/2016/5/11/chartex" xmlns:cx6="http://schemas.microsoft.com/office/drawing/2016/5/12/chartex" xmlns:cx7="http://schemas.microsoft.com/office/drawing/2016/5/13/chartex" xmlns:cx8="http://schemas.microsoft.com/office/drawing/2016/5/14/chartex" xmlns:mc="http://schemas.openxmlformats.org/markup-compatibility/2006" xmlns:aink="http://schemas.microsoft.com/office/drawing/2016/ink" xmlns:am3d="http://schemas.microsoft.com/office/drawing/2017/model3d" xmlns:o="urn:schemas-microsoft-com:office:office" xmlns:oel="http://schemas.microsoft.com/office/2019/extlst" xmlns:r="http://schemas.openxmlformats.org/officeDocument/2006/relationships" xmlns:m="http://schemas.openxmlformats.org/officeDocument/2006/math" xmlns:v="urn:schemas-microsoft-com:vml" xmlns:wp14="http://schemas.microsoft.com/office/word/2010/wordprocessingDrawing" xmlns:wp="http://schemas.openxmlformats.org/drawingml/2006/wordprocessingDrawing" xmlns:w10="urn:schemas-microsoft-com:office:word" xmlns:w="http://schemas.openxmlformats.org/wordprocessingml/2006/main" xmlns:w14="http://schemas.microsoft.com/office/word/2010/wordml" xmlns:w15="http://schemas.microsoft.com/office/word/2012/wordml" xmlns:w16cex="http://schemas.microsoft.com/office/word/2018/wordml/cex" xmlns:w16cid="http://schemas.microsoft.com/office/word/2016/wordml/cid" xmlns:w16="http://schemas.microsoft.com/office/word/2018/wordml" xmlns:w16du="http://schemas.microsoft.com/office/word/2023/wordml/word16du" xmlns:w16sdtdh="http://schemas.microsoft.com/office/word/2020/wordml/sdtdatahash" xmlns:w16sdtfl="http://schemas.microsoft.com/office/word/2024/wordml/sdtformatlock" xmlns:w16se="http://schemas.microsoft.com/office/word/2015/wordml/symex" xmlns:wpg="http://schemas.microsoft.com/office/word/2010/wordprocessingGroup" xmlns:wpi="http://schemas.microsoft.com/office/word/2010/wordprocessingInk" xmlns:wne="http://schemas.microsoft.com/office/word/2006/wordml" xmlns:wps="http://schemas.microsoft.com/office/word/2010/wordprocessingShape" mc:Ignorable="w14 w15 w16se w16cid w16 w16cex w16sdtdh w16sdtfl w16du wp14">
   <w:body>
     <w:p>
       <w:pPr>
@@ -297,7 +297,15 @@
         <w:t>development tools</w:t>
       </w:r>
       <w:r>
-        <w:t xml:space="preserve"> like the Java compiler (javac), debugger, and documentation generators. You need this to </w:t>
+        <w:t xml:space="preserve"> like the Java compiler (</w:t>
+      </w:r>
+      <w:proofErr w:type="spellStart"/>
+      <w:r>
+        <w:t>javac</w:t>
+      </w:r>
+      <w:proofErr w:type="spellEnd"/>
+      <w:r>
+        <w:t xml:space="preserve">), debugger, and documentation generators. You need this to </w:t>
       </w:r>
       <w:r>
         <w:rPr>
@@ -335,7 +343,15 @@
         <w:t>Correction Note:</w:t>
       </w:r>
       <w:r>
-        <w:t xml:space="preserve"> Java is case-sensitive (public, not Public). Class names cannot contain spaces (HelloWorld), and the print command uses a lowercase l (println, short for "print line").</w:t>
+        <w:t xml:space="preserve"> Java is case-sensitive (public, not Public). Class names cannot contain spaces (HelloWorld), and the print command uses a lowercase l (</w:t>
+      </w:r>
+      <w:proofErr w:type="spellStart"/>
+      <w:r>
+        <w:t>println</w:t>
+      </w:r>
+      <w:proofErr w:type="spellEnd"/>
+      <w:r>
+        <w:t>, short for "print line").</w:t>
       </w:r>
     </w:p>
     <w:p>
@@ -350,12 +366,36 @@
     </w:p>
     <w:p>
       <w:r>
-        <w:t xml:space="preserve">    public static void main(String[] args) {</w:t>
-      </w:r>
-    </w:p>
-    <w:p>
-      <w:r>
-        <w:t xml:space="preserve">        System.out.println("Hello World!");</w:t>
+        <w:t xml:space="preserve">    public static void </w:t>
+      </w:r>
+      <w:proofErr w:type="gramStart"/>
+      <w:r>
+        <w:t>main(String[</w:t>
+      </w:r>
+      <w:proofErr w:type="gramEnd"/>
+      <w:r>
+        <w:t xml:space="preserve">] </w:t>
+      </w:r>
+      <w:proofErr w:type="spellStart"/>
+      <w:r>
+        <w:t>args</w:t>
+      </w:r>
+      <w:proofErr w:type="spellEnd"/>
+      <w:r>
+        <w:t>) {</w:t>
+      </w:r>
+    </w:p>
+    <w:p>
+      <w:r>
+        <w:t xml:space="preserve">        </w:t>
+      </w:r>
+      <w:proofErr w:type="spellStart"/>
+      <w:r>
+        <w:t>System.out.println</w:t>
+      </w:r>
+      <w:proofErr w:type="spellEnd"/>
+      <w:r>
+        <w:t>("Hello World!");</w:t>
       </w:r>
     </w:p>
     <w:p>
@@ -648,7 +688,23 @@
                 <w:b/>
                 <w:bCs/>
               </w:rPr>
-              <w:t>Example (a=10,b=4)</w:t>
+              <w:t>Example (a=</w:t>
+            </w:r>
+            <w:proofErr w:type="gramStart"/>
+            <w:r>
+              <w:rPr>
+                <w:b/>
+                <w:bCs/>
+              </w:rPr>
+              <w:t>10,b</w:t>
+            </w:r>
+            <w:proofErr w:type="gramEnd"/>
+            <w:r>
+              <w:rPr>
+                <w:b/>
+                <w:bCs/>
+              </w:rPr>
+              <w:t>=4)</w:t>
             </w:r>
           </w:p>
         </w:tc>
@@ -1325,7 +1381,15 @@
     </w:p>
     <w:p>
       <w:r>
-        <w:t>To compile and run your code in a terminal terminal console, chain the two commands together:</w:t>
+        <w:t xml:space="preserve">To compile and run your code in a terminal </w:t>
+      </w:r>
+      <w:proofErr w:type="spellStart"/>
+      <w:r>
+        <w:t>terminal</w:t>
+      </w:r>
+      <w:proofErr w:type="spellEnd"/>
+      <w:r>
+        <w:t xml:space="preserve"> console, chain the two commands together:</w:t>
       </w:r>
     </w:p>
     <w:p>
@@ -1334,8 +1398,13 @@
       </w:r>
     </w:p>
     <w:p>
-      <w:r>
-        <w:t>javac Arithmetic.java &amp;&amp; java Arithmetic</w:t>
+      <w:proofErr w:type="spellStart"/>
+      <w:r>
+        <w:t>javac</w:t>
+      </w:r>
+      <w:proofErr w:type="spellEnd"/>
+      <w:r>
+        <w:t xml:space="preserve"> Arithmetic.java &amp;&amp; java Arithmetic</w:t>
       </w:r>
     </w:p>
     <w:p>
@@ -1360,7 +1429,15 @@
     </w:p>
     <w:p>
       <w:r>
-        <w:t>import java.io.*;</w:t>
+        <w:t xml:space="preserve">import </w:t>
+      </w:r>
+      <w:proofErr w:type="gramStart"/>
+      <w:r>
+        <w:t>java.io.*</w:t>
+      </w:r>
+      <w:proofErr w:type="gramEnd"/>
+      <w:r>
+        <w:t>;</w:t>
       </w:r>
     </w:p>
     <w:p/>
@@ -1371,7 +1448,23 @@
     </w:p>
     <w:p>
       <w:r>
-        <w:t xml:space="preserve">    public static void main(String[] args) {</w:t>
+        <w:t xml:space="preserve">    public static void </w:t>
+      </w:r>
+      <w:proofErr w:type="gramStart"/>
+      <w:r>
+        <w:t>main(String[</w:t>
+      </w:r>
+      <w:proofErr w:type="gramEnd"/>
+      <w:r>
+        <w:t xml:space="preserve">] </w:t>
+      </w:r>
+      <w:proofErr w:type="spellStart"/>
+      <w:r>
+        <w:t>args</w:t>
+      </w:r>
+      <w:proofErr w:type="spellEnd"/>
+      <w:r>
+        <w:t>) {</w:t>
       </w:r>
     </w:p>
     <w:p>
@@ -1409,43 +1502,107 @@
     </w:p>
     <w:p>
       <w:r>
-        <w:t xml:space="preserve">        int a1 = Integer.parseInt(n1);</w:t>
-      </w:r>
-    </w:p>
-    <w:p>
-      <w:r>
-        <w:t xml:space="preserve">        int b1 = Integer.parseInt(n2);</w:t>
+        <w:t xml:space="preserve">        int a1 = </w:t>
+      </w:r>
+      <w:proofErr w:type="spellStart"/>
+      <w:r>
+        <w:t>Integer.parseInt</w:t>
+      </w:r>
+      <w:proofErr w:type="spellEnd"/>
+      <w:r>
+        <w:t>(n1);</w:t>
+      </w:r>
+    </w:p>
+    <w:p>
+      <w:r>
+        <w:t xml:space="preserve">        int b1 = </w:t>
+      </w:r>
+      <w:proofErr w:type="spellStart"/>
+      <w:r>
+        <w:t>Integer.parseInt</w:t>
+      </w:r>
+      <w:proofErr w:type="spellEnd"/>
+      <w:r>
+        <w:t>(n2);</w:t>
       </w:r>
     </w:p>
     <w:p/>
     <w:p>
       <w:r>
-        <w:t xml:space="preserve">        System.out.println("Addition of a and b is: " + (a + b));</w:t>
-      </w:r>
-    </w:p>
-    <w:p>
-      <w:r>
-        <w:t xml:space="preserve">        System.out.println("Subtraction of a and b is: " + (a - b));</w:t>
-      </w:r>
-    </w:p>
-    <w:p>
-      <w:r>
-        <w:t xml:space="preserve">        System.out.println("Multiplication of a and b is: " + (a * b));</w:t>
-      </w:r>
-    </w:p>
-    <w:p>
-      <w:r>
-        <w:t xml:space="preserve">        System.out.println("Division of a and b is: " + (a / b));</w:t>
-      </w:r>
-    </w:p>
-    <w:p>
-      <w:r>
-        <w:t xml:space="preserve">        System.out.println("Modulus of a and b is: " + (a % b));</w:t>
-      </w:r>
-    </w:p>
-    <w:p>
-      <w:r>
-        <w:t xml:space="preserve">        System.out.println("Addition of a1 and b1 is: " + (a1 + b1));  </w:t>
+        <w:t xml:space="preserve">        </w:t>
+      </w:r>
+      <w:proofErr w:type="spellStart"/>
+      <w:r>
+        <w:t>System.out.println</w:t>
+      </w:r>
+      <w:proofErr w:type="spellEnd"/>
+      <w:r>
+        <w:t>("Addition of a and b is: " + (a + b));</w:t>
+      </w:r>
+    </w:p>
+    <w:p>
+      <w:r>
+        <w:t xml:space="preserve">        </w:t>
+      </w:r>
+      <w:proofErr w:type="spellStart"/>
+      <w:r>
+        <w:t>System.out.println</w:t>
+      </w:r>
+      <w:proofErr w:type="spellEnd"/>
+      <w:r>
+        <w:t>("Subtraction of a and b is: " + (a - b));</w:t>
+      </w:r>
+    </w:p>
+    <w:p>
+      <w:r>
+        <w:t xml:space="preserve">        </w:t>
+      </w:r>
+      <w:proofErr w:type="spellStart"/>
+      <w:r>
+        <w:t>System.out.println</w:t>
+      </w:r>
+      <w:proofErr w:type="spellEnd"/>
+      <w:r>
+        <w:t>("Multiplication of a and b is: " + (a * b));</w:t>
+      </w:r>
+    </w:p>
+    <w:p>
+      <w:r>
+        <w:t xml:space="preserve">        </w:t>
+      </w:r>
+      <w:proofErr w:type="spellStart"/>
+      <w:r>
+        <w:t>System.out.println</w:t>
+      </w:r>
+      <w:proofErr w:type="spellEnd"/>
+      <w:r>
+        <w:t>("Division of a and b is: " + (a / b));</w:t>
+      </w:r>
+    </w:p>
+    <w:p>
+      <w:r>
+        <w:t xml:space="preserve">        </w:t>
+      </w:r>
+      <w:proofErr w:type="spellStart"/>
+      <w:r>
+        <w:t>System.out.println</w:t>
+      </w:r>
+      <w:proofErr w:type="spellEnd"/>
+      <w:r>
+        <w:t>("Modulus of a and b is: " + (a % b));</w:t>
+      </w:r>
+    </w:p>
+    <w:p>
+      <w:r>
+        <w:t xml:space="preserve">        </w:t>
+      </w:r>
+      <w:proofErr w:type="spellStart"/>
+      <w:r>
+        <w:t>System.out.println</w:t>
+      </w:r>
+      <w:proofErr w:type="spellEnd"/>
+      <w:r>
+        <w:t xml:space="preserve">("Addition of a1 and b1 is: " + (a1 + b1));  </w:t>
       </w:r>
     </w:p>
     <w:p>
@@ -2143,31 +2300,44 @@
           </w:tcPr>
           <w:p>
             <w:r>
-              <w:t>Inverts a boolean condition state.</w:t>
-            </w:r>
-          </w:p>
-        </w:tc>
-        <w:tc>
-          <w:tcPr>
-            <w:tcW w:w="0" w:type="auto"/>
-            <w:tcBorders>
-              <w:top w:val="single" w:sz="6" w:space="0" w:color="C4C7C5"/>
-              <w:left w:val="single" w:sz="6" w:space="0" w:color="C4C7C5"/>
-              <w:bottom w:val="single" w:sz="6" w:space="0" w:color="C4C7C5"/>
-              <w:right w:val="single" w:sz="6" w:space="0" w:color="C4C7C5"/>
-            </w:tcBorders>
-            <w:tcMar>
-              <w:top w:w="120" w:type="dxa"/>
-              <w:left w:w="180" w:type="dxa"/>
-              <w:bottom w:w="120" w:type="dxa"/>
-              <w:right w:w="180" w:type="dxa"/>
-            </w:tcMar>
-            <w:vAlign w:val="center"/>
-            <w:hideMark/>
-          </w:tcPr>
-          <w:p>
-            <w:r>
-              <w:t>!true; // false</w:t>
+              <w:t xml:space="preserve">Inverts a </w:t>
+            </w:r>
+            <w:proofErr w:type="spellStart"/>
+            <w:r>
+              <w:t>boolean</w:t>
+            </w:r>
+            <w:proofErr w:type="spellEnd"/>
+            <w:r>
+              <w:t xml:space="preserve"> condition state.</w:t>
+            </w:r>
+          </w:p>
+        </w:tc>
+        <w:tc>
+          <w:tcPr>
+            <w:tcW w:w="0" w:type="auto"/>
+            <w:tcBorders>
+              <w:top w:val="single" w:sz="6" w:space="0" w:color="C4C7C5"/>
+              <w:left w:val="single" w:sz="6" w:space="0" w:color="C4C7C5"/>
+              <w:bottom w:val="single" w:sz="6" w:space="0" w:color="C4C7C5"/>
+              <w:right w:val="single" w:sz="6" w:space="0" w:color="C4C7C5"/>
+            </w:tcBorders>
+            <w:tcMar>
+              <w:top w:w="120" w:type="dxa"/>
+              <w:left w:w="180" w:type="dxa"/>
+              <w:bottom w:w="120" w:type="dxa"/>
+              <w:right w:w="180" w:type="dxa"/>
+            </w:tcMar>
+            <w:vAlign w:val="center"/>
+            <w:hideMark/>
+          </w:tcPr>
+          <w:p>
+            <w:proofErr w:type="gramStart"/>
+            <w:r>
+              <w:t>!true</w:t>
+            </w:r>
+            <w:proofErr w:type="gramEnd"/>
+            <w:r>
+              <w:t>; // false</w:t>
             </w:r>
           </w:p>
         </w:tc>
@@ -2398,7 +2568,15 @@
     </w:p>
     <w:p>
       <w:r>
-        <w:t>import java.io.*;</w:t>
+        <w:t xml:space="preserve">import </w:t>
+      </w:r>
+      <w:proofErr w:type="gramStart"/>
+      <w:r>
+        <w:t>java.io.*</w:t>
+      </w:r>
+      <w:proofErr w:type="gramEnd"/>
+      <w:r>
+        <w:t>;</w:t>
       </w:r>
     </w:p>
     <w:p/>
@@ -2409,7 +2587,23 @@
     </w:p>
     <w:p>
       <w:r>
-        <w:t xml:space="preserve">    public static void main(String[] args) {</w:t>
+        <w:t xml:space="preserve">    public static void </w:t>
+      </w:r>
+      <w:proofErr w:type="gramStart"/>
+      <w:r>
+        <w:t>main(String[</w:t>
+      </w:r>
+      <w:proofErr w:type="gramEnd"/>
+      <w:r>
+        <w:t xml:space="preserve">] </w:t>
+      </w:r>
+      <w:proofErr w:type="spellStart"/>
+      <w:r>
+        <w:t>args</w:t>
+      </w:r>
+      <w:proofErr w:type="spellEnd"/>
+      <w:r>
+        <w:t>) {</w:t>
       </w:r>
     </w:p>
     <w:p>
@@ -2425,33 +2619,73 @@
     </w:p>
     <w:p>
       <w:r>
-        <w:t xml:space="preserve">        System.out.println("Value of a is: " + a);</w:t>
-      </w:r>
-    </w:p>
-    <w:p>
-      <w:r>
-        <w:t xml:space="preserve">        System.out.println("Value of b is: " + b);</w:t>
-      </w:r>
-    </w:p>
-    <w:p>
-      <w:r>
         <w:t xml:space="preserve">        </w:t>
       </w:r>
-    </w:p>
-    <w:p>
-      <w:r>
-        <w:t xml:space="preserve">        // Prints 10, then 'a' changes to 11</w:t>
-      </w:r>
-    </w:p>
-    <w:p>
-      <w:r>
-        <w:t xml:space="preserve">        System.out.println("Value of Post increment i.e a++ is: " + (a++));</w:t>
+      <w:proofErr w:type="spellStart"/>
+      <w:r>
+        <w:t>System.out.println</w:t>
+      </w:r>
+      <w:proofErr w:type="spellEnd"/>
+      <w:r>
+        <w:t>("Value of a is: " + a);</w:t>
       </w:r>
     </w:p>
     <w:p>
       <w:r>
         <w:t xml:space="preserve">        </w:t>
       </w:r>
+      <w:proofErr w:type="spellStart"/>
+      <w:r>
+        <w:t>System.out.println</w:t>
+      </w:r>
+      <w:proofErr w:type="spellEnd"/>
+      <w:r>
+        <w:t>("Value of b is: " + b);</w:t>
+      </w:r>
+    </w:p>
+    <w:p>
+      <w:r>
+        <w:t xml:space="preserve">        </w:t>
+      </w:r>
+    </w:p>
+    <w:p>
+      <w:r>
+        <w:t xml:space="preserve">        // Prints 10, then 'a' </w:t>
+      </w:r>
+      <w:proofErr w:type="gramStart"/>
+      <w:r>
+        <w:t>changes</w:t>
+      </w:r>
+      <w:proofErr w:type="gramEnd"/>
+      <w:r>
+        <w:t xml:space="preserve"> to 11</w:t>
+      </w:r>
+    </w:p>
+    <w:p>
+      <w:r>
+        <w:t xml:space="preserve">        </w:t>
+      </w:r>
+      <w:proofErr w:type="spellStart"/>
+      <w:r>
+        <w:t>System.out.println</w:t>
+      </w:r>
+      <w:proofErr w:type="spellEnd"/>
+      <w:r>
+        <w:t xml:space="preserve">("Value of Post increment </w:t>
+      </w:r>
+      <w:proofErr w:type="spellStart"/>
+      <w:r>
+        <w:t>i.e</w:t>
+      </w:r>
+      <w:proofErr w:type="spellEnd"/>
+      <w:r>
+        <w:t xml:space="preserve"> a++ is: " + (a++));</w:t>
+      </w:r>
+    </w:p>
+    <w:p>
+      <w:r>
+        <w:t xml:space="preserve">        </w:t>
+      </w:r>
     </w:p>
     <w:p>
       <w:r>
@@ -2460,22 +2694,23 @@
     </w:p>
     <w:p>
       <w:r>
-        <w:t xml:space="preserve">        System.out.println("Value of Pre increment i.e ++b is: " + (++b));</w:t>
-      </w:r>
-    </w:p>
-    <w:p>
-      <w:r>
         <w:t xml:space="preserve">        </w:t>
       </w:r>
-    </w:p>
-    <w:p>
-      <w:r>
-        <w:t xml:space="preserve">        // Prints 11 (current 'a'), then 'a' decrements to 10</w:t>
-      </w:r>
-    </w:p>
-    <w:p>
-      <w:r>
-        <w:t xml:space="preserve">        System.out.println("Value of Post decrement i.e a-- is: " + (a--));</w:t>
+      <w:proofErr w:type="spellStart"/>
+      <w:r>
+        <w:t>System.out.println</w:t>
+      </w:r>
+      <w:proofErr w:type="spellEnd"/>
+      <w:r>
+        <w:t xml:space="preserve">("Value of Pre increment </w:t>
+      </w:r>
+      <w:proofErr w:type="spellStart"/>
+      <w:r>
+        <w:t>i.e</w:t>
+      </w:r>
+      <w:proofErr w:type="spellEnd"/>
+      <w:r>
+        <w:t xml:space="preserve"> ++b is: " + (++b));</w:t>
       </w:r>
     </w:p>
     <w:p>
@@ -2485,12 +2720,67 @@
     </w:p>
     <w:p>
       <w:r>
+        <w:t xml:space="preserve">        // Prints 11 (current 'a'), then 'a' </w:t>
+      </w:r>
+      <w:proofErr w:type="gramStart"/>
+      <w:r>
+        <w:t>decrements</w:t>
+      </w:r>
+      <w:proofErr w:type="gramEnd"/>
+      <w:r>
+        <w:t xml:space="preserve"> to 10</w:t>
+      </w:r>
+    </w:p>
+    <w:p>
+      <w:r>
+        <w:t xml:space="preserve">        </w:t>
+      </w:r>
+      <w:proofErr w:type="spellStart"/>
+      <w:r>
+        <w:t>System.out.println</w:t>
+      </w:r>
+      <w:proofErr w:type="spellEnd"/>
+      <w:r>
+        <w:t xml:space="preserve">("Value of Post decrement </w:t>
+      </w:r>
+      <w:proofErr w:type="spellStart"/>
+      <w:r>
+        <w:t>i.e</w:t>
+      </w:r>
+      <w:proofErr w:type="spellEnd"/>
+      <w:r>
+        <w:t xml:space="preserve"> a-- is: " + (a--));</w:t>
+      </w:r>
+    </w:p>
+    <w:p>
+      <w:r>
+        <w:t xml:space="preserve">        </w:t>
+      </w:r>
+    </w:p>
+    <w:p>
+      <w:r>
         <w:t xml:space="preserve">        // 'b' becomes 10 immediately, then prints 10</w:t>
       </w:r>
     </w:p>
     <w:p>
       <w:r>
-        <w:t xml:space="preserve">        System.out.println("Value of Pre decrement i.e --b is: " + (--b));</w:t>
+        <w:t xml:space="preserve">        </w:t>
+      </w:r>
+      <w:proofErr w:type="spellStart"/>
+      <w:r>
+        <w:t>System.out.println</w:t>
+      </w:r>
+      <w:proofErr w:type="spellEnd"/>
+      <w:r>
+        <w:t xml:space="preserve">("Value of Pre decrement </w:t>
+      </w:r>
+      <w:proofErr w:type="spellStart"/>
+      <w:r>
+        <w:t>i.e</w:t>
+      </w:r>
+      <w:proofErr w:type="spellEnd"/>
+      <w:r>
+        <w:t xml:space="preserve"> --b is: " + (--b));</w:t>
       </w:r>
     </w:p>
     <w:p>
@@ -2529,22 +2819,54 @@
     </w:p>
     <w:p>
       <w:r>
-        <w:t>Value of Post increment i.e a++ is: 10</w:t>
-      </w:r>
-    </w:p>
-    <w:p>
-      <w:r>
-        <w:t>Value of Pre increment i.e ++b is: 11</w:t>
-      </w:r>
-    </w:p>
-    <w:p>
-      <w:r>
-        <w:t>Value of Post decrement i.e a-- is: 11</w:t>
-      </w:r>
-    </w:p>
-    <w:p>
-      <w:r>
-        <w:t>Value of Pre decrement i.e --b is: 10</w:t>
+        <w:t xml:space="preserve">Value of Post increment </w:t>
+      </w:r>
+      <w:proofErr w:type="spellStart"/>
+      <w:r>
+        <w:t>i.e</w:t>
+      </w:r>
+      <w:proofErr w:type="spellEnd"/>
+      <w:r>
+        <w:t xml:space="preserve"> a++ is: 10</w:t>
+      </w:r>
+    </w:p>
+    <w:p>
+      <w:r>
+        <w:t xml:space="preserve">Value of Pre increment </w:t>
+      </w:r>
+      <w:proofErr w:type="spellStart"/>
+      <w:r>
+        <w:t>i.e</w:t>
+      </w:r>
+      <w:proofErr w:type="spellEnd"/>
+      <w:r>
+        <w:t xml:space="preserve"> ++b is: 11</w:t>
+      </w:r>
+    </w:p>
+    <w:p>
+      <w:r>
+        <w:t xml:space="preserve">Value of Post decrement </w:t>
+      </w:r>
+      <w:proofErr w:type="spellStart"/>
+      <w:r>
+        <w:t>i.e</w:t>
+      </w:r>
+      <w:proofErr w:type="spellEnd"/>
+      <w:r>
+        <w:t xml:space="preserve"> a-- is: 11</w:t>
+      </w:r>
+    </w:p>
+    <w:p>
+      <w:r>
+        <w:t xml:space="preserve">Value of Pre decrement </w:t>
+      </w:r>
+      <w:proofErr w:type="spellStart"/>
+      <w:r>
+        <w:t>i.e</w:t>
+      </w:r>
+      <w:proofErr w:type="spellEnd"/>
+      <w:r>
+        <w:t xml:space="preserve"> --b is: 10</w:t>
       </w:r>
     </w:p>
     <w:p>
@@ -3842,7 +4164,15 @@
         <w:t>always</w:t>
       </w:r>
       <w:r>
-        <w:t xml:space="preserve"> yield a boolean value (true or false). </w:t>
+        <w:t xml:space="preserve"> yield a </w:t>
+      </w:r>
+      <w:proofErr w:type="spellStart"/>
+      <w:r>
+        <w:t>boolean</w:t>
+      </w:r>
+      <w:proofErr w:type="spellEnd"/>
+      <w:r>
+        <w:t xml:space="preserve"> value (true or false). </w:t>
       </w:r>
     </w:p>
     <w:tbl>
@@ -3975,7 +4305,23 @@
                 <w:b/>
                 <w:bCs/>
               </w:rPr>
-              <w:t>Example (x=10,y=20)</w:t>
+              <w:t>Example (x=</w:t>
+            </w:r>
+            <w:proofErr w:type="gramStart"/>
+            <w:r>
+              <w:rPr>
+                <w:b/>
+                <w:bCs/>
+              </w:rPr>
+              <w:t>10,y</w:t>
+            </w:r>
+            <w:proofErr w:type="gramEnd"/>
+            <w:r>
+              <w:rPr>
+                <w:b/>
+                <w:bCs/>
+              </w:rPr>
+              <w:t>=20)</w:t>
             </w:r>
           </w:p>
         </w:tc>
@@ -4228,8 +4574,13 @@
             <w:hideMark/>
           </w:tcPr>
           <w:p>
-            <w:r>
-              <w:t>x != y</w:t>
+            <w:proofErr w:type="gramStart"/>
+            <w:r>
+              <w:t>x !</w:t>
+            </w:r>
+            <w:proofErr w:type="gramEnd"/>
+            <w:r>
+              <w:t>= y</w:t>
             </w:r>
           </w:p>
         </w:tc>
@@ -4781,18 +5132,50 @@
     </w:p>
     <w:p>
       <w:r>
-        <w:t>import java.io.*;</w:t>
+        <w:t xml:space="preserve">import </w:t>
+      </w:r>
+      <w:proofErr w:type="gramStart"/>
+      <w:r>
+        <w:t>java.io.*</w:t>
+      </w:r>
+      <w:proofErr w:type="gramEnd"/>
+      <w:r>
+        <w:t>;</w:t>
       </w:r>
     </w:p>
     <w:p/>
     <w:p>
       <w:r>
-        <w:t>class RelationalOperator {</w:t>
-      </w:r>
-    </w:p>
-    <w:p>
-      <w:r>
-        <w:t xml:space="preserve">    public static void main(String[] args) {</w:t>
+        <w:t xml:space="preserve">class </w:t>
+      </w:r>
+      <w:proofErr w:type="spellStart"/>
+      <w:r>
+        <w:t>RelationalOperator</w:t>
+      </w:r>
+      <w:proofErr w:type="spellEnd"/>
+      <w:r>
+        <w:t xml:space="preserve"> {</w:t>
+      </w:r>
+    </w:p>
+    <w:p>
+      <w:r>
+        <w:t xml:space="preserve">    public static void </w:t>
+      </w:r>
+      <w:proofErr w:type="gramStart"/>
+      <w:r>
+        <w:t>main(String[</w:t>
+      </w:r>
+      <w:proofErr w:type="gramEnd"/>
+      <w:r>
+        <w:t xml:space="preserve">] </w:t>
+      </w:r>
+      <w:proofErr w:type="spellStart"/>
+      <w:r>
+        <w:t>args</w:t>
+      </w:r>
+      <w:proofErr w:type="spellEnd"/>
+      <w:r>
+        <w:t>) {</w:t>
       </w:r>
     </w:p>
     <w:p>
@@ -4803,32 +5186,88 @@
     <w:p>
       <w:r>
         <w:lastRenderedPageBreak/>
-        <w:t xml:space="preserve">        System.out.println("a is greater than b: " + (a &gt; b));</w:t>
-      </w:r>
-    </w:p>
-    <w:p>
-      <w:r>
-        <w:t xml:space="preserve">        System.out.println("a is less than b: " + (a &lt; b));</w:t>
-      </w:r>
-    </w:p>
-    <w:p>
-      <w:r>
-        <w:t xml:space="preserve">        System.out.println("a is equal to b: " + (a == b));</w:t>
-      </w:r>
-    </w:p>
-    <w:p>
-      <w:r>
-        <w:t xml:space="preserve">        System.out.println("a is not equal to b: " + (a != b));</w:t>
-      </w:r>
-    </w:p>
-    <w:p>
-      <w:r>
-        <w:t xml:space="preserve">        System.out.println("a is greater than or equal to b: " + (a &gt;= b));</w:t>
-      </w:r>
-    </w:p>
-    <w:p>
-      <w:r>
-        <w:t xml:space="preserve">        System.out.println("a is less than or equal to b: " + (a &lt;= b));</w:t>
+        <w:t xml:space="preserve">        </w:t>
+      </w:r>
+      <w:proofErr w:type="spellStart"/>
+      <w:r>
+        <w:t>System.out.println</w:t>
+      </w:r>
+      <w:proofErr w:type="spellEnd"/>
+      <w:r>
+        <w:t>("a is greater than b: " + (a &gt; b));</w:t>
+      </w:r>
+    </w:p>
+    <w:p>
+      <w:r>
+        <w:t xml:space="preserve">        </w:t>
+      </w:r>
+      <w:proofErr w:type="spellStart"/>
+      <w:r>
+        <w:t>System.out.println</w:t>
+      </w:r>
+      <w:proofErr w:type="spellEnd"/>
+      <w:r>
+        <w:t>("a is less than b: " + (a &lt; b));</w:t>
+      </w:r>
+    </w:p>
+    <w:p>
+      <w:r>
+        <w:t xml:space="preserve">        </w:t>
+      </w:r>
+      <w:proofErr w:type="spellStart"/>
+      <w:r>
+        <w:t>System.out.println</w:t>
+      </w:r>
+      <w:proofErr w:type="spellEnd"/>
+      <w:r>
+        <w:t>("a is equal to b: " + (a == b));</w:t>
+      </w:r>
+    </w:p>
+    <w:p>
+      <w:r>
+        <w:t xml:space="preserve">        </w:t>
+      </w:r>
+      <w:proofErr w:type="spellStart"/>
+      <w:r>
+        <w:t>System.out.println</w:t>
+      </w:r>
+      <w:proofErr w:type="spellEnd"/>
+      <w:r>
+        <w:t>("a is not equal to b: " + (</w:t>
+      </w:r>
+      <w:proofErr w:type="gramStart"/>
+      <w:r>
+        <w:t>a !</w:t>
+      </w:r>
+      <w:proofErr w:type="gramEnd"/>
+      <w:r>
+        <w:t>= b));</w:t>
+      </w:r>
+    </w:p>
+    <w:p>
+      <w:r>
+        <w:t xml:space="preserve">        </w:t>
+      </w:r>
+      <w:proofErr w:type="spellStart"/>
+      <w:r>
+        <w:t>System.out.println</w:t>
+      </w:r>
+      <w:proofErr w:type="spellEnd"/>
+      <w:r>
+        <w:t>("a is greater than or equal to b: " + (a &gt;= b));</w:t>
+      </w:r>
+    </w:p>
+    <w:p>
+      <w:r>
+        <w:t xml:space="preserve">        </w:t>
+      </w:r>
+      <w:proofErr w:type="spellStart"/>
+      <w:r>
+        <w:t>System.out.println</w:t>
+      </w:r>
+      <w:proofErr w:type="spellEnd"/>
+      <w:r>
+        <w:t>("a is less than or equal to b: " + (a &lt;= b));</w:t>
       </w:r>
     </w:p>
     <w:p>
@@ -4902,7 +5341,15 @@
     </w:p>
     <w:p>
       <w:r>
-        <w:t>Used to bundle individual boolean statements or invert specific conditions.</w:t>
+        <w:t xml:space="preserve">Used to bundle individual </w:t>
+      </w:r>
+      <w:proofErr w:type="spellStart"/>
+      <w:r>
+        <w:t>boolean</w:t>
+      </w:r>
+      <w:proofErr w:type="spellEnd"/>
+      <w:r>
+        <w:t xml:space="preserve"> statements or invert specific conditions.</w:t>
       </w:r>
     </w:p>
     <w:tbl>
@@ -5333,9 +5780,16 @@
             <w:hideMark/>
           </w:tcPr>
           <w:p>
-            <w:r>
-              <w:t>!cond</w:t>
-            </w:r>
+            <w:proofErr w:type="gramStart"/>
+            <w:r>
+              <w:t>!</w:t>
+            </w:r>
+            <w:proofErr w:type="spellStart"/>
+            <w:r>
+              <w:t>cond</w:t>
+            </w:r>
+            <w:proofErr w:type="spellEnd"/>
+            <w:proofErr w:type="gramEnd"/>
           </w:p>
         </w:tc>
         <w:tc>
@@ -5386,18 +5840,50 @@
     </w:p>
     <w:p>
       <w:r>
-        <w:t>import java.io.*;</w:t>
+        <w:t xml:space="preserve">import </w:t>
+      </w:r>
+      <w:proofErr w:type="gramStart"/>
+      <w:r>
+        <w:t>java.io.*</w:t>
+      </w:r>
+      <w:proofErr w:type="gramEnd"/>
+      <w:r>
+        <w:t>;</w:t>
       </w:r>
     </w:p>
     <w:p/>
     <w:p>
       <w:r>
-        <w:t>class LogicalOperator {</w:t>
-      </w:r>
-    </w:p>
-    <w:p>
-      <w:r>
-        <w:t xml:space="preserve">    public static void main(String[] args) {</w:t>
+        <w:t xml:space="preserve">class </w:t>
+      </w:r>
+      <w:proofErr w:type="spellStart"/>
+      <w:r>
+        <w:t>LogicalOperator</w:t>
+      </w:r>
+      <w:proofErr w:type="spellEnd"/>
+      <w:r>
+        <w:t xml:space="preserve"> {</w:t>
+      </w:r>
+    </w:p>
+    <w:p>
+      <w:r>
+        <w:t xml:space="preserve">    public static void </w:t>
+      </w:r>
+      <w:proofErr w:type="gramStart"/>
+      <w:r>
+        <w:t>main(String[</w:t>
+      </w:r>
+      <w:proofErr w:type="gramEnd"/>
+      <w:r>
+        <w:t xml:space="preserve">] </w:t>
+      </w:r>
+      <w:proofErr w:type="spellStart"/>
+      <w:r>
+        <w:t>args</w:t>
+      </w:r>
+      <w:proofErr w:type="spellEnd"/>
+      <w:r>
+        <w:t>) {</w:t>
       </w:r>
     </w:p>
     <w:p>
@@ -5407,17 +5893,49 @@
     </w:p>
     <w:p>
       <w:r>
-        <w:t xml:space="preserve">        System.out.println("a &gt; b &amp;&amp; a &lt; b: " + (a &gt; b &amp;&amp; a &lt; b));</w:t>
-      </w:r>
-    </w:p>
-    <w:p>
-      <w:r>
-        <w:t xml:space="preserve">        System.out.println("a &gt; b || a &lt; b: " + (a &gt; b || a &lt; b));</w:t>
-      </w:r>
-    </w:p>
-    <w:p>
-      <w:r>
-        <w:t xml:space="preserve">        System.out.println("not a is greater than b: " + !(a &gt; b));</w:t>
+        <w:t xml:space="preserve">        </w:t>
+      </w:r>
+      <w:proofErr w:type="spellStart"/>
+      <w:r>
+        <w:t>System.out.println</w:t>
+      </w:r>
+      <w:proofErr w:type="spellEnd"/>
+      <w:r>
+        <w:t>("a &gt; b &amp;&amp; a &lt; b: " + (a &gt; b &amp;&amp; a &lt; b));</w:t>
+      </w:r>
+    </w:p>
+    <w:p>
+      <w:r>
+        <w:t xml:space="preserve">        </w:t>
+      </w:r>
+      <w:proofErr w:type="spellStart"/>
+      <w:r>
+        <w:t>System.out.println</w:t>
+      </w:r>
+      <w:proofErr w:type="spellEnd"/>
+      <w:r>
+        <w:t>("a &gt; b || a &lt; b: " + (a &gt; b || a &lt; b));</w:t>
+      </w:r>
+    </w:p>
+    <w:p>
+      <w:r>
+        <w:t xml:space="preserve">        </w:t>
+      </w:r>
+      <w:proofErr w:type="spellStart"/>
+      <w:r>
+        <w:t>System.out.println</w:t>
+      </w:r>
+      <w:proofErr w:type="spellEnd"/>
+      <w:r>
+        <w:t xml:space="preserve">("not a is greater than b: " </w:t>
+      </w:r>
+      <w:proofErr w:type="gramStart"/>
+      <w:r>
+        <w:t>+ !</w:t>
+      </w:r>
+      <w:proofErr w:type="gramEnd"/>
+      <w:r>
+        <w:t>(a &gt; b));</w:t>
       </w:r>
     </w:p>
     <w:p>
@@ -5471,7 +5989,15 @@
           <w:b/>
           <w:bCs/>
         </w:rPr>
-        <w:t>6. Ternary Operator (</w:t>
+        <w:t xml:space="preserve">6. Ternary Operator </w:t>
+      </w:r>
+      <w:proofErr w:type="gramStart"/>
+      <w:r>
+        <w:rPr>
+          <w:b/>
+          <w:bCs/>
+        </w:rPr>
+        <w:t>(</w:t>
       </w:r>
       <w:r>
         <w:t>?:</w:t>
@@ -5483,10 +6009,40 @@
         </w:rPr>
         <w:t>)</w:t>
       </w:r>
-    </w:p>
-    <w:p>
-      <w:r>
-        <w:t>A clean, single-line shorthand structural alternative to standard if-else blocks. It handles three operands sequentially: Condition ? ValueIfTrue : ValueIfFalse.</w:t>
+      <w:proofErr w:type="gramEnd"/>
+    </w:p>
+    <w:p>
+      <w:r>
+        <w:t xml:space="preserve">A clean, single-line shorthand structural alternative to standard if-else blocks. It handles three operands sequentially: </w:t>
+      </w:r>
+      <w:proofErr w:type="gramStart"/>
+      <w:r>
+        <w:t>Condition ?</w:t>
+      </w:r>
+      <w:proofErr w:type="gramEnd"/>
+      <w:r>
+        <w:t xml:space="preserve"> </w:t>
+      </w:r>
+      <w:proofErr w:type="spellStart"/>
+      <w:proofErr w:type="gramStart"/>
+      <w:r>
+        <w:t>ValueIfTrue</w:t>
+      </w:r>
+      <w:proofErr w:type="spellEnd"/>
+      <w:r>
+        <w:t xml:space="preserve"> :</w:t>
+      </w:r>
+      <w:proofErr w:type="gramEnd"/>
+      <w:r>
+        <w:t xml:space="preserve"> </w:t>
+      </w:r>
+      <w:proofErr w:type="spellStart"/>
+      <w:r>
+        <w:t>ValueIfFalse</w:t>
+      </w:r>
+      <w:proofErr w:type="spellEnd"/>
+      <w:r>
+        <w:t>.</w:t>
       </w:r>
     </w:p>
     <w:p>
@@ -5517,18 +6073,50 @@
     </w:p>
     <w:p>
       <w:r>
-        <w:t>import java.io.*;</w:t>
+        <w:t xml:space="preserve">import </w:t>
+      </w:r>
+      <w:proofErr w:type="gramStart"/>
+      <w:r>
+        <w:t>java.io.*</w:t>
+      </w:r>
+      <w:proofErr w:type="gramEnd"/>
+      <w:r>
+        <w:t>;</w:t>
       </w:r>
     </w:p>
     <w:p/>
     <w:p>
       <w:r>
-        <w:t>class TernaryOperator {</w:t>
-      </w:r>
-    </w:p>
-    <w:p>
-      <w:r>
-        <w:t xml:space="preserve">    public static void main(String[] args) {</w:t>
+        <w:t xml:space="preserve">class </w:t>
+      </w:r>
+      <w:proofErr w:type="spellStart"/>
+      <w:r>
+        <w:t>TernaryOperator</w:t>
+      </w:r>
+      <w:proofErr w:type="spellEnd"/>
+      <w:r>
+        <w:t xml:space="preserve"> {</w:t>
+      </w:r>
+    </w:p>
+    <w:p>
+      <w:r>
+        <w:t xml:space="preserve">    public static void </w:t>
+      </w:r>
+      <w:proofErr w:type="gramStart"/>
+      <w:r>
+        <w:t>main(String[</w:t>
+      </w:r>
+      <w:proofErr w:type="gramEnd"/>
+      <w:r>
+        <w:t xml:space="preserve">] </w:t>
+      </w:r>
+      <w:proofErr w:type="spellStart"/>
+      <w:r>
+        <w:t>args</w:t>
+      </w:r>
+      <w:proofErr w:type="spellEnd"/>
+      <w:r>
+        <w:t>) {</w:t>
       </w:r>
     </w:p>
     <w:p>
@@ -5548,7 +6136,23 @@
     </w:p>
     <w:p>
       <w:r>
-        <w:t xml:space="preserve">        // Tracing: Is 20 &gt; 40? False. Jump to the false block -&gt; (b &gt; c) ? b : c</w:t>
+        <w:t xml:space="preserve">        // Tracing: Is 20 &gt; 40? False. Jump to the false block -&gt; (b &gt; c</w:t>
+      </w:r>
+      <w:proofErr w:type="gramStart"/>
+      <w:r>
+        <w:t>) ?</w:t>
+      </w:r>
+      <w:proofErr w:type="gramEnd"/>
+      <w:r>
+        <w:t xml:space="preserve"> </w:t>
+      </w:r>
+      <w:proofErr w:type="gramStart"/>
+      <w:r>
+        <w:t>b :</w:t>
+      </w:r>
+      <w:proofErr w:type="gramEnd"/>
+      <w:r>
+        <w:t xml:space="preserve"> c</w:t>
       </w:r>
     </w:p>
     <w:p>
@@ -5558,7 +6162,55 @@
     </w:p>
     <w:p>
       <w:r>
-        <w:t xml:space="preserve">        result = (a &gt; b) ? ((a &gt; c) ? a : c) : ((b &gt; c) ? b : c);</w:t>
+        <w:t xml:space="preserve">        result = (a &gt; b</w:t>
+      </w:r>
+      <w:proofErr w:type="gramStart"/>
+      <w:r>
+        <w:t>) ?</w:t>
+      </w:r>
+      <w:proofErr w:type="gramEnd"/>
+      <w:r>
+        <w:t xml:space="preserve"> ((a &gt; c</w:t>
+      </w:r>
+      <w:proofErr w:type="gramStart"/>
+      <w:r>
+        <w:t>) ?</w:t>
+      </w:r>
+      <w:proofErr w:type="gramEnd"/>
+      <w:r>
+        <w:t xml:space="preserve"> </w:t>
+      </w:r>
+      <w:proofErr w:type="gramStart"/>
+      <w:r>
+        <w:t>a :</w:t>
+      </w:r>
+      <w:proofErr w:type="gramEnd"/>
+      <w:r>
+        <w:t xml:space="preserve"> c</w:t>
+      </w:r>
+      <w:proofErr w:type="gramStart"/>
+      <w:r>
+        <w:t>) :</w:t>
+      </w:r>
+      <w:proofErr w:type="gramEnd"/>
+      <w:r>
+        <w:t xml:space="preserve"> ((b &gt; c</w:t>
+      </w:r>
+      <w:proofErr w:type="gramStart"/>
+      <w:r>
+        <w:t>) ?</w:t>
+      </w:r>
+      <w:proofErr w:type="gramEnd"/>
+      <w:r>
+        <w:t xml:space="preserve"> </w:t>
+      </w:r>
+      <w:proofErr w:type="gramStart"/>
+      <w:r>
+        <w:t>b :</w:t>
+      </w:r>
+      <w:proofErr w:type="gramEnd"/>
+      <w:r>
+        <w:t xml:space="preserve"> c);</w:t>
       </w:r>
     </w:p>
     <w:p>
@@ -5568,7 +6220,15 @@
     </w:p>
     <w:p>
       <w:r>
-        <w:t xml:space="preserve">        System.out.println("The largest number is: " + result);</w:t>
+        <w:t xml:space="preserve">        </w:t>
+      </w:r>
+      <w:proofErr w:type="spellStart"/>
+      <w:r>
+        <w:t>System.out.println</w:t>
+      </w:r>
+      <w:proofErr w:type="spellEnd"/>
+      <w:r>
+        <w:t>("The largest number is: " + result);</w:t>
       </w:r>
     </w:p>
     <w:p>
@@ -6209,7 +6869,39 @@
                 <w:b/>
                 <w:bCs/>
               </w:rPr>
-              <w:t>Unary operator that inverts all bits (0 \(\leftrightarrow \) 1). Formulated as -(n + 1).</w:t>
+              <w:t xml:space="preserve">Unary operator that inverts all bits (0 </w:t>
+            </w:r>
+            <w:proofErr w:type="gramStart"/>
+            <w:r>
+              <w:rPr>
+                <w:b/>
+                <w:bCs/>
+              </w:rPr>
+              <w:t>\(</w:t>
+            </w:r>
+            <w:proofErr w:type="gramEnd"/>
+            <w:r>
+              <w:rPr>
+                <w:b/>
+                <w:bCs/>
+              </w:rPr>
+              <w:t>\</w:t>
+            </w:r>
+            <w:proofErr w:type="spellStart"/>
+            <w:r>
+              <w:rPr>
+                <w:b/>
+                <w:bCs/>
+              </w:rPr>
+              <w:t>leftrightarrow</w:t>
+            </w:r>
+            <w:proofErr w:type="spellEnd"/>
+            <w:r>
+              <w:rPr>
+                <w:b/>
+                <w:bCs/>
+              </w:rPr>
+              <w:t xml:space="preserve"> \) 1). Formulated as -(n + 1).</w:t>
             </w:r>
           </w:p>
         </w:tc>
@@ -6283,13 +6975,26 @@
     </w:p>
     <w:p>
       <w:r>
-        <w:t>import java.io.*;</w:t>
-      </w:r>
-    </w:p>
-    <w:p>
-      <w:r>
-        <w:t>class bitwiseoperator</w:t>
-      </w:r>
+        <w:t xml:space="preserve">import </w:t>
+      </w:r>
+      <w:proofErr w:type="gramStart"/>
+      <w:r>
+        <w:t>java.io.*</w:t>
+      </w:r>
+      <w:proofErr w:type="gramEnd"/>
+      <w:r>
+        <w:t>;</w:t>
+      </w:r>
+    </w:p>
+    <w:p>
+      <w:r>
+        <w:t xml:space="preserve">class </w:t>
+      </w:r>
+      <w:proofErr w:type="spellStart"/>
+      <w:r>
+        <w:t>bitwiseoperator</w:t>
+      </w:r>
+      <w:proofErr w:type="spellEnd"/>
     </w:p>
     <w:p>
       <w:r>
@@ -6298,7 +7003,23 @@
     </w:p>
     <w:p>
       <w:r>
-        <w:t>    public static void main(String[] args)</w:t>
+        <w:t xml:space="preserve">    public static void </w:t>
+      </w:r>
+      <w:proofErr w:type="gramStart"/>
+      <w:r>
+        <w:t>main(String[</w:t>
+      </w:r>
+      <w:proofErr w:type="gramEnd"/>
+      <w:r>
+        <w:t xml:space="preserve">] </w:t>
+      </w:r>
+      <w:proofErr w:type="spellStart"/>
+      <w:r>
+        <w:t>args</w:t>
+      </w:r>
+      <w:proofErr w:type="spellEnd"/>
+      <w:r>
+        <w:t>)</w:t>
       </w:r>
     </w:p>
     <w:p>
@@ -6320,37 +7041,93 @@
     <w:p/>
     <w:p>
       <w:r>
-        <w:t>        System.out.println("Bitwise AND of d and e is: " + (d &amp; e));</w:t>
-      </w:r>
-    </w:p>
-    <w:p>
-      <w:r>
-        <w:t>        System.out.println("Bitwise OR of d and e is: " + (d | e));</w:t>
-      </w:r>
-    </w:p>
-    <w:p>
-      <w:r>
-        <w:t>        System.out.println("Bitwise XOR of d and e is: " + (d ^ e));</w:t>
-      </w:r>
-    </w:p>
-    <w:p>
-      <w:r>
-        <w:t>        System.out.println("Bitwise NOT of d is: " + (~d));</w:t>
-      </w:r>
-    </w:p>
-    <w:p>
-      <w:r>
-        <w:t>        System.out.println("Left shift (d &lt;&lt; 2) result: " + (d &lt;&lt; 2));</w:t>
-      </w:r>
-    </w:p>
-    <w:p>
-      <w:r>
-        <w:t>        System.out.println("Right shift (e &gt;&gt; 2) result: " + (e &gt;&gt; 2));</w:t>
-      </w:r>
-    </w:p>
-    <w:p>
-      <w:r>
-        <w:t>        System.out.println("Unsigned right shift (e &gt;&gt;&gt; 1) result: " + (e &gt;&gt;&gt; 1));</w:t>
+        <w:t xml:space="preserve">        </w:t>
+      </w:r>
+      <w:proofErr w:type="spellStart"/>
+      <w:r>
+        <w:t>System.out.println</w:t>
+      </w:r>
+      <w:proofErr w:type="spellEnd"/>
+      <w:r>
+        <w:t>("Bitwise AND of d and e is: " + (d &amp; e));</w:t>
+      </w:r>
+    </w:p>
+    <w:p>
+      <w:r>
+        <w:t xml:space="preserve">        </w:t>
+      </w:r>
+      <w:proofErr w:type="spellStart"/>
+      <w:r>
+        <w:t>System.out.println</w:t>
+      </w:r>
+      <w:proofErr w:type="spellEnd"/>
+      <w:r>
+        <w:t>("Bitwise OR of d and e is: " + (d | e));</w:t>
+      </w:r>
+    </w:p>
+    <w:p>
+      <w:r>
+        <w:t xml:space="preserve">        </w:t>
+      </w:r>
+      <w:proofErr w:type="spellStart"/>
+      <w:r>
+        <w:t>System.out.println</w:t>
+      </w:r>
+      <w:proofErr w:type="spellEnd"/>
+      <w:r>
+        <w:t>("Bitwise XOR of d and e is: " + (d ^ e));</w:t>
+      </w:r>
+    </w:p>
+    <w:p>
+      <w:r>
+        <w:t xml:space="preserve">        </w:t>
+      </w:r>
+      <w:proofErr w:type="spellStart"/>
+      <w:r>
+        <w:t>System.out.println</w:t>
+      </w:r>
+      <w:proofErr w:type="spellEnd"/>
+      <w:r>
+        <w:t>("Bitwise NOT of d is: " + (~d));</w:t>
+      </w:r>
+    </w:p>
+    <w:p>
+      <w:r>
+        <w:t xml:space="preserve">        </w:t>
+      </w:r>
+      <w:proofErr w:type="spellStart"/>
+      <w:r>
+        <w:t>System.out.println</w:t>
+      </w:r>
+      <w:proofErr w:type="spellEnd"/>
+      <w:r>
+        <w:t>("Left shift (d &lt;&lt; 2) result: " + (d &lt;&lt; 2));</w:t>
+      </w:r>
+    </w:p>
+    <w:p>
+      <w:r>
+        <w:t xml:space="preserve">        </w:t>
+      </w:r>
+      <w:proofErr w:type="spellStart"/>
+      <w:r>
+        <w:t>System.out.println</w:t>
+      </w:r>
+      <w:proofErr w:type="spellEnd"/>
+      <w:r>
+        <w:t>("Right shift (e &gt;&gt; 2) result: " + (e &gt;&gt; 2));</w:t>
+      </w:r>
+    </w:p>
+    <w:p>
+      <w:r>
+        <w:t xml:space="preserve">        </w:t>
+      </w:r>
+      <w:proofErr w:type="spellStart"/>
+      <w:r>
+        <w:t>System.out.println</w:t>
+      </w:r>
+      <w:proofErr w:type="spellEnd"/>
+      <w:r>
+        <w:t>("Unsigned right shift (e &gt;&gt;&gt; 1) result: " + (e &gt;&gt;&gt; 1));</w:t>
       </w:r>
     </w:p>
     <w:p>
@@ -6644,8 +7421,13 @@
     </w:p>
     <w:p>
       <w:r>
-        <w:t>class IfDemo</w:t>
-      </w:r>
+        <w:t xml:space="preserve">class </w:t>
+      </w:r>
+      <w:proofErr w:type="spellStart"/>
+      <w:r>
+        <w:t>IfDemo</w:t>
+      </w:r>
+      <w:proofErr w:type="spellEnd"/>
     </w:p>
     <w:p>
       <w:r>
@@ -6654,7 +7436,28 @@
     </w:p>
     <w:p>
       <w:r>
-        <w:t>    public static void main(String args[])</w:t>
+        <w:t xml:space="preserve">    public static void </w:t>
+      </w:r>
+      <w:proofErr w:type="gramStart"/>
+      <w:r>
+        <w:t>main(</w:t>
+      </w:r>
+      <w:proofErr w:type="gramEnd"/>
+      <w:r>
+        <w:t xml:space="preserve">String </w:t>
+      </w:r>
+      <w:proofErr w:type="spellStart"/>
+      <w:proofErr w:type="gramStart"/>
+      <w:r>
+        <w:t>args</w:t>
+      </w:r>
+      <w:proofErr w:type="spellEnd"/>
+      <w:r>
+        <w:t>[</w:t>
+      </w:r>
+      <w:proofErr w:type="gramEnd"/>
+      <w:r>
+        <w:t>])</w:t>
       </w:r>
     </w:p>
     <w:p>
@@ -6664,32 +7467,77 @@
     </w:p>
     <w:p>
       <w:r>
-        <w:t>        int i = 10;</w:t>
-      </w:r>
-    </w:p>
-    <w:p>
-      <w:r>
-        <w:t>        if(i &lt; 15)</w:t>
+        <w:t xml:space="preserve">        int </w:t>
+      </w:r>
+      <w:proofErr w:type="spellStart"/>
+      <w:r>
+        <w:t>i</w:t>
+      </w:r>
+      <w:proofErr w:type="spellEnd"/>
+      <w:r>
+        <w:t xml:space="preserve"> = 10;</w:t>
       </w:r>
     </w:p>
     <w:p>
       <w:r>
         <w:t xml:space="preserve">        </w:t>
       </w:r>
-    </w:p>
-    <w:p>
-      <w:r>
-        <w:t>            System.out.println("Inside if block");  </w:t>
-      </w:r>
-    </w:p>
-    <w:p>
-      <w:r>
-        <w:t>            System.out.println("10 is less than 15");</w:t>
-      </w:r>
-    </w:p>
-    <w:p>
-      <w:r>
-        <w:t>            System.out.println("Outside if block");</w:t>
+      <w:proofErr w:type="gramStart"/>
+      <w:r>
+        <w:t>if(</w:t>
+      </w:r>
+      <w:proofErr w:type="spellStart"/>
+      <w:proofErr w:type="gramEnd"/>
+      <w:r>
+        <w:t>i</w:t>
+      </w:r>
+      <w:proofErr w:type="spellEnd"/>
+      <w:r>
+        <w:t xml:space="preserve"> &lt; 15)</w:t>
+      </w:r>
+    </w:p>
+    <w:p>
+      <w:r>
+        <w:t xml:space="preserve">        </w:t>
+      </w:r>
+    </w:p>
+    <w:p>
+      <w:r>
+        <w:t xml:space="preserve">            </w:t>
+      </w:r>
+      <w:proofErr w:type="spellStart"/>
+      <w:r>
+        <w:t>System.out.println</w:t>
+      </w:r>
+      <w:proofErr w:type="spellEnd"/>
+      <w:r>
+        <w:t>("Inside if block");  </w:t>
+      </w:r>
+    </w:p>
+    <w:p>
+      <w:r>
+        <w:t xml:space="preserve">            </w:t>
+      </w:r>
+      <w:proofErr w:type="spellStart"/>
+      <w:r>
+        <w:t>System.out.println</w:t>
+      </w:r>
+      <w:proofErr w:type="spellEnd"/>
+      <w:r>
+        <w:t>("10 is less than 15");</w:t>
+      </w:r>
+    </w:p>
+    <w:p>
+      <w:r>
+        <w:t xml:space="preserve">            </w:t>
+      </w:r>
+      <w:proofErr w:type="spellStart"/>
+      <w:r>
+        <w:t>System.out.println</w:t>
+      </w:r>
+      <w:proofErr w:type="spellEnd"/>
+      <w:r>
+        <w:t>("Outside if block");</w:t>
       </w:r>
     </w:p>
     <w:p>
@@ -6839,8 +7687,13 @@
     </w:p>
     <w:p>
       <w:r>
-        <w:t>class IfElseDemo</w:t>
-      </w:r>
+        <w:t xml:space="preserve">class </w:t>
+      </w:r>
+      <w:proofErr w:type="spellStart"/>
+      <w:r>
+        <w:t>IfElseDemo</w:t>
+      </w:r>
+      <w:proofErr w:type="spellEnd"/>
     </w:p>
     <w:p>
       <w:r>
@@ -6849,7 +7702,28 @@
     </w:p>
     <w:p>
       <w:r>
-        <w:t>    public static void main(String args[])</w:t>
+        <w:t xml:space="preserve">    public static void </w:t>
+      </w:r>
+      <w:proofErr w:type="gramStart"/>
+      <w:r>
+        <w:t>main(</w:t>
+      </w:r>
+      <w:proofErr w:type="gramEnd"/>
+      <w:r>
+        <w:t xml:space="preserve">String </w:t>
+      </w:r>
+      <w:proofErr w:type="spellStart"/>
+      <w:proofErr w:type="gramStart"/>
+      <w:r>
+        <w:t>args</w:t>
+      </w:r>
+      <w:proofErr w:type="spellEnd"/>
+      <w:r>
+        <w:t>[</w:t>
+      </w:r>
+      <w:proofErr w:type="gramEnd"/>
+      <w:r>
+        <w:t>])</w:t>
       </w:r>
     </w:p>
     <w:p>
@@ -6859,17 +7733,46 @@
     </w:p>
     <w:p>
       <w:r>
-        <w:t>        int i = 10;</w:t>
-      </w:r>
-    </w:p>
-    <w:p>
-      <w:r>
-        <w:t>        if(i &lt; 15)</w:t>
-      </w:r>
-    </w:p>
-    <w:p>
-      <w:r>
-        <w:t>            System.out.println("10 is less than 15");</w:t>
+        <w:t xml:space="preserve">        int </w:t>
+      </w:r>
+      <w:proofErr w:type="spellStart"/>
+      <w:r>
+        <w:t>i</w:t>
+      </w:r>
+      <w:proofErr w:type="spellEnd"/>
+      <w:r>
+        <w:t xml:space="preserve"> = 10;</w:t>
+      </w:r>
+    </w:p>
+    <w:p>
+      <w:r>
+        <w:t xml:space="preserve">        </w:t>
+      </w:r>
+      <w:proofErr w:type="gramStart"/>
+      <w:r>
+        <w:t>if(</w:t>
+      </w:r>
+      <w:proofErr w:type="spellStart"/>
+      <w:proofErr w:type="gramEnd"/>
+      <w:r>
+        <w:t>i</w:t>
+      </w:r>
+      <w:proofErr w:type="spellEnd"/>
+      <w:r>
+        <w:t xml:space="preserve"> &lt; 15)</w:t>
+      </w:r>
+    </w:p>
+    <w:p>
+      <w:r>
+        <w:t xml:space="preserve">            </w:t>
+      </w:r>
+      <w:proofErr w:type="spellStart"/>
+      <w:r>
+        <w:t>System.out.println</w:t>
+      </w:r>
+      <w:proofErr w:type="spellEnd"/>
+      <w:r>
+        <w:t>("10 is less than 15");</w:t>
       </w:r>
     </w:p>
     <w:p>
@@ -6879,7 +7782,15 @@
     </w:p>
     <w:p>
       <w:r>
-        <w:t>            System.out.println("10 is not less than 15");</w:t>
+        <w:t xml:space="preserve">            </w:t>
+      </w:r>
+      <w:proofErr w:type="spellStart"/>
+      <w:r>
+        <w:t>System.out.println</w:t>
+      </w:r>
+      <w:proofErr w:type="spellEnd"/>
+      <w:r>
+        <w:t>("10 is not less than 15");</w:t>
       </w:r>
     </w:p>
     <w:p>
@@ -7135,12 +8046,21 @@
           <w:numId w:val="10"/>
         </w:numPr>
       </w:pPr>
-      <w:r>
-        <w:rPr>
-          <w:b/>
-          <w:bCs/>
-        </w:rPr>
-        <w:t>read()</w:t>
+      <w:proofErr w:type="gramStart"/>
+      <w:r>
+        <w:rPr>
+          <w:b/>
+          <w:bCs/>
+        </w:rPr>
+        <w:t>read(</w:t>
+      </w:r>
+      <w:proofErr w:type="gramEnd"/>
+      <w:r>
+        <w:rPr>
+          <w:b/>
+          <w:bCs/>
+        </w:rPr>
+        <w:t>)</w:t>
       </w:r>
       <w:r>
         <w:t xml:space="preserve"> – Reads a single character. </w:t>
@@ -7158,7 +8078,23 @@
           <w:b/>
           <w:bCs/>
         </w:rPr>
-        <w:t>read(char[] c)</w:t>
+        <w:t>read(</w:t>
+      </w:r>
+      <w:proofErr w:type="gramStart"/>
+      <w:r>
+        <w:rPr>
+          <w:b/>
+          <w:bCs/>
+        </w:rPr>
+        <w:t>char[</w:t>
+      </w:r>
+      <w:proofErr w:type="gramEnd"/>
+      <w:r>
+        <w:rPr>
+          <w:b/>
+          <w:bCs/>
+        </w:rPr>
+        <w:t>] c)</w:t>
       </w:r>
       <w:r>
         <w:t xml:space="preserve"> – Reads multiple characters into a character array. </w:t>
@@ -7171,12 +8107,30 @@
           <w:numId w:val="10"/>
         </w:numPr>
       </w:pPr>
-      <w:r>
-        <w:rPr>
-          <w:b/>
-          <w:bCs/>
-        </w:rPr>
-        <w:t>readLine()</w:t>
+      <w:proofErr w:type="spellStart"/>
+      <w:proofErr w:type="gramStart"/>
+      <w:r>
+        <w:rPr>
+          <w:b/>
+          <w:bCs/>
+        </w:rPr>
+        <w:t>readLine</w:t>
+      </w:r>
+      <w:proofErr w:type="spellEnd"/>
+      <w:r>
+        <w:rPr>
+          <w:b/>
+          <w:bCs/>
+        </w:rPr>
+        <w:t>(</w:t>
+      </w:r>
+      <w:proofErr w:type="gramEnd"/>
+      <w:r>
+        <w:rPr>
+          <w:b/>
+          <w:bCs/>
+        </w:rPr>
+        <w:t>)</w:t>
       </w:r>
       <w:r>
         <w:t xml:space="preserve"> – Reads an entire line of text and returns it as a String.</w:t>
@@ -7184,6 +8138,7 @@
     </w:p>
     <w:p/>
     <w:p>
+      <w:proofErr w:type="spellStart"/>
       <w:r>
         <w:rPr>
           <w:b/>
@@ -7191,6 +8146,7 @@
         </w:rPr>
         <w:t>BufferReader</w:t>
       </w:r>
+      <w:proofErr w:type="spellEnd"/>
       <w:r>
         <w:t xml:space="preserve"> class throws IO Exceptions </w:t>
       </w:r>
@@ -7213,29 +8169,55 @@
     </w:p>
     <w:p>
       <w:r>
-        <w:t xml:space="preserve">Its and advance version of BufferReader which was later added in java, Scanner can read formatted input it has different functions for different types of data types </w:t>
-      </w:r>
-    </w:p>
-    <w:p>
-      <w:pPr>
-        <w:rPr>
-          <w:b/>
-          <w:bCs/>
-        </w:rPr>
-      </w:pPr>
-      <w:r>
-        <w:rPr>
-          <w:b/>
-          <w:bCs/>
-        </w:rPr>
-        <w:t>1. To read Integer: - nextInt</w:t>
-      </w:r>
-      <w:r>
-        <w:rPr>
-          <w:b/>
-          <w:bCs/>
-        </w:rPr>
-        <w:t>()</w:t>
+        <w:t xml:space="preserve">Its and advance version of </w:t>
+      </w:r>
+      <w:proofErr w:type="spellStart"/>
+      <w:r>
+        <w:t>BufferReader</w:t>
+      </w:r>
+      <w:proofErr w:type="spellEnd"/>
+      <w:r>
+        <w:t xml:space="preserve"> which was later added in java, Scanner can read formatted input it has different functions for different types of data types </w:t>
+      </w:r>
+    </w:p>
+    <w:p>
+      <w:pPr>
+        <w:rPr>
+          <w:b/>
+          <w:bCs/>
+        </w:rPr>
+      </w:pPr>
+      <w:r>
+        <w:rPr>
+          <w:b/>
+          <w:bCs/>
+        </w:rPr>
+        <w:t xml:space="preserve">1. To read Integer: - </w:t>
+      </w:r>
+      <w:proofErr w:type="spellStart"/>
+      <w:proofErr w:type="gramStart"/>
+      <w:r>
+        <w:rPr>
+          <w:b/>
+          <w:bCs/>
+        </w:rPr>
+        <w:t>nextInt</w:t>
+      </w:r>
+      <w:proofErr w:type="spellEnd"/>
+      <w:r>
+        <w:rPr>
+          <w:b/>
+          <w:bCs/>
+        </w:rPr>
+        <w:t>(</w:t>
+      </w:r>
+      <w:proofErr w:type="gramEnd"/>
+      <w:r>
+        <w:rPr>
+          <w:b/>
+          <w:bCs/>
+        </w:rPr>
+        <w:t>)</w:t>
       </w:r>
     </w:p>
     <w:p>
@@ -7252,19 +8234,46 @@
         </w:rPr>
         <w:t xml:space="preserve">2. String/Character values: - </w:t>
       </w:r>
-      <w:r>
-        <w:rPr>
-          <w:b/>
-          <w:bCs/>
-        </w:rPr>
-        <w:t>nextLine(</w:t>
-      </w:r>
-      <w:r>
-        <w:rPr>
-          <w:b/>
-          <w:bCs/>
-        </w:rPr>
-        <w:t>) / next()</w:t>
+      <w:proofErr w:type="spellStart"/>
+      <w:proofErr w:type="gramStart"/>
+      <w:r>
+        <w:rPr>
+          <w:b/>
+          <w:bCs/>
+        </w:rPr>
+        <w:t>nextLine</w:t>
+      </w:r>
+      <w:proofErr w:type="spellEnd"/>
+      <w:r>
+        <w:rPr>
+          <w:b/>
+          <w:bCs/>
+        </w:rPr>
+        <w:t>(</w:t>
+      </w:r>
+      <w:proofErr w:type="gramEnd"/>
+      <w:r>
+        <w:rPr>
+          <w:b/>
+          <w:bCs/>
+        </w:rPr>
+        <w:t xml:space="preserve">) / </w:t>
+      </w:r>
+      <w:proofErr w:type="gramStart"/>
+      <w:r>
+        <w:rPr>
+          <w:b/>
+          <w:bCs/>
+        </w:rPr>
+        <w:t>next(</w:t>
+      </w:r>
+      <w:proofErr w:type="gramEnd"/>
+      <w:r>
+        <w:rPr>
+          <w:b/>
+          <w:bCs/>
+        </w:rPr>
+        <w:t>)</w:t>
       </w:r>
     </w:p>
     <w:p>
@@ -7340,13 +8349,31 @@
     </w:p>
     <w:p>
       <w:r>
-        <w:t xml:space="preserve"> import java.util.Scanner;</w:t>
-      </w:r>
-    </w:p>
-    <w:p>
-      <w:r>
-        <w:t>class StudentInfo</w:t>
-      </w:r>
+        <w:t xml:space="preserve"> import </w:t>
+      </w:r>
+      <w:proofErr w:type="spellStart"/>
+      <w:proofErr w:type="gramStart"/>
+      <w:r>
+        <w:t>java.util</w:t>
+      </w:r>
+      <w:proofErr w:type="gramEnd"/>
+      <w:r>
+        <w:t>.Scanner</w:t>
+      </w:r>
+      <w:proofErr w:type="spellEnd"/>
+      <w:r>
+        <w:t>;</w:t>
+      </w:r>
+    </w:p>
+    <w:p>
+      <w:r>
+        <w:t xml:space="preserve">class </w:t>
+      </w:r>
+      <w:proofErr w:type="spellStart"/>
+      <w:r>
+        <w:t>StudentInfo</w:t>
+      </w:r>
+      <w:proofErr w:type="spellEnd"/>
     </w:p>
     <w:p>
       <w:r>
@@ -7355,7 +8382,28 @@
     </w:p>
     <w:p>
       <w:r>
-        <w:t>    public static void main(String args[])</w:t>
+        <w:t xml:space="preserve">    public static void </w:t>
+      </w:r>
+      <w:proofErr w:type="gramStart"/>
+      <w:r>
+        <w:t>main(</w:t>
+      </w:r>
+      <w:proofErr w:type="gramEnd"/>
+      <w:r>
+        <w:t xml:space="preserve">String </w:t>
+      </w:r>
+      <w:proofErr w:type="spellStart"/>
+      <w:proofErr w:type="gramStart"/>
+      <w:r>
+        <w:t>args</w:t>
+      </w:r>
+      <w:proofErr w:type="spellEnd"/>
+      <w:r>
+        <w:t>[</w:t>
+      </w:r>
+      <w:proofErr w:type="gramEnd"/>
+      <w:r>
+        <w:t>])</w:t>
       </w:r>
     </w:p>
     <w:p>
@@ -7365,52 +8413,130 @@
     </w:p>
     <w:p>
       <w:r>
-        <w:t>        Scanner sc = new Scanner(System.in);</w:t>
-      </w:r>
-    </w:p>
-    <w:p>
-      <w:r>
-        <w:t>        System.out.print("Enter student name: ");</w:t>
-      </w:r>
-    </w:p>
-    <w:p>
-      <w:r>
-        <w:t>        String name = sc.nextLine();</w:t>
-      </w:r>
-    </w:p>
-    <w:p>
-      <w:r>
-        <w:t>        System.out.print("Enter student PRN: ");</w:t>
-      </w:r>
-    </w:p>
-    <w:p>
-      <w:r>
-        <w:t>        String prn = sc.nextLine();</w:t>
+        <w:t xml:space="preserve">        Scanner </w:t>
+      </w:r>
+      <w:proofErr w:type="spellStart"/>
+      <w:r>
+        <w:t>sc</w:t>
+      </w:r>
+      <w:proofErr w:type="spellEnd"/>
+      <w:r>
+        <w:t xml:space="preserve"> = new </w:t>
+      </w:r>
+      <w:proofErr w:type="gramStart"/>
+      <w:r>
+        <w:t>Scanner(</w:t>
+      </w:r>
+      <w:proofErr w:type="gramEnd"/>
+      <w:r>
+        <w:t>System.in);</w:t>
       </w:r>
     </w:p>
     <w:p>
       <w:r>
         <w:t xml:space="preserve">        </w:t>
       </w:r>
-    </w:p>
-    <w:p>
-      <w:r>
-        <w:t>        System.out.println("Student Name: " + name);</w:t>
-      </w:r>
-    </w:p>
-    <w:p>
-      <w:r>
-        <w:t>        System.out.println("Student PRN: " + prn);</w:t>
+      <w:proofErr w:type="spellStart"/>
+      <w:r>
+        <w:t>System.out.print</w:t>
+      </w:r>
+      <w:proofErr w:type="spellEnd"/>
+      <w:r>
+        <w:t>("Enter student name: ");</w:t>
+      </w:r>
+    </w:p>
+    <w:p>
+      <w:r>
+        <w:t xml:space="preserve">        String name = </w:t>
+      </w:r>
+      <w:proofErr w:type="spellStart"/>
+      <w:proofErr w:type="gramStart"/>
+      <w:r>
+        <w:t>sc.nextLine</w:t>
+      </w:r>
+      <w:proofErr w:type="spellEnd"/>
+      <w:proofErr w:type="gramEnd"/>
+      <w:r>
+        <w:t>();</w:t>
       </w:r>
     </w:p>
     <w:p>
       <w:r>
         <w:t xml:space="preserve">        </w:t>
       </w:r>
-    </w:p>
-    <w:p>
-      <w:r>
-        <w:t>        sc.close();</w:t>
+      <w:proofErr w:type="spellStart"/>
+      <w:r>
+        <w:t>System.out.print</w:t>
+      </w:r>
+      <w:proofErr w:type="spellEnd"/>
+      <w:r>
+        <w:t>("Enter student PRN: ");</w:t>
+      </w:r>
+    </w:p>
+    <w:p>
+      <w:r>
+        <w:t xml:space="preserve">        String prn = </w:t>
+      </w:r>
+      <w:proofErr w:type="spellStart"/>
+      <w:proofErr w:type="gramStart"/>
+      <w:r>
+        <w:t>sc.nextLine</w:t>
+      </w:r>
+      <w:proofErr w:type="spellEnd"/>
+      <w:proofErr w:type="gramEnd"/>
+      <w:r>
+        <w:t>();</w:t>
+      </w:r>
+    </w:p>
+    <w:p>
+      <w:r>
+        <w:t xml:space="preserve">        </w:t>
+      </w:r>
+    </w:p>
+    <w:p>
+      <w:r>
+        <w:t xml:space="preserve">        </w:t>
+      </w:r>
+      <w:proofErr w:type="spellStart"/>
+      <w:r>
+        <w:t>System.out.println</w:t>
+      </w:r>
+      <w:proofErr w:type="spellEnd"/>
+      <w:r>
+        <w:t>("Student Name: " + name);</w:t>
+      </w:r>
+    </w:p>
+    <w:p>
+      <w:r>
+        <w:t xml:space="preserve">        </w:t>
+      </w:r>
+      <w:proofErr w:type="spellStart"/>
+      <w:r>
+        <w:t>System.out.println</w:t>
+      </w:r>
+      <w:proofErr w:type="spellEnd"/>
+      <w:r>
+        <w:t>("Student PRN: " + prn);</w:t>
+      </w:r>
+    </w:p>
+    <w:p>
+      <w:r>
+        <w:t xml:space="preserve">        </w:t>
+      </w:r>
+    </w:p>
+    <w:p>
+      <w:r>
+        <w:t xml:space="preserve">        </w:t>
+      </w:r>
+      <w:proofErr w:type="spellStart"/>
+      <w:proofErr w:type="gramStart"/>
+      <w:r>
+        <w:t>sc.close</w:t>
+      </w:r>
+      <w:proofErr w:type="spellEnd"/>
+      <w:proofErr w:type="gramEnd"/>
+      <w:r>
+        <w:t>();</w:t>
       </w:r>
     </w:p>
     <w:p>
@@ -7559,7 +8685,20 @@
         <w:t xml:space="preserve"> </w:t>
       </w:r>
       <w:r>
-        <w:t>import java.util.Scanner;</w:t>
+        <w:t xml:space="preserve">import </w:t>
+      </w:r>
+      <w:proofErr w:type="spellStart"/>
+      <w:proofErr w:type="gramStart"/>
+      <w:r>
+        <w:t>java.util</w:t>
+      </w:r>
+      <w:proofErr w:type="gramEnd"/>
+      <w:r>
+        <w:t>.Scanner</w:t>
+      </w:r>
+      <w:proofErr w:type="spellEnd"/>
+      <w:r>
+        <w:t>;</w:t>
       </w:r>
     </w:p>
     <w:p>
@@ -7574,7 +8713,28 @@
     </w:p>
     <w:p>
       <w:r>
-        <w:t>    public static void main(String args[])</w:t>
+        <w:t xml:space="preserve">    public static void </w:t>
+      </w:r>
+      <w:proofErr w:type="gramStart"/>
+      <w:r>
+        <w:t>main(</w:t>
+      </w:r>
+      <w:proofErr w:type="gramEnd"/>
+      <w:r>
+        <w:t xml:space="preserve">String </w:t>
+      </w:r>
+      <w:proofErr w:type="spellStart"/>
+      <w:proofErr w:type="gramStart"/>
+      <w:r>
+        <w:t>args</w:t>
+      </w:r>
+      <w:proofErr w:type="spellEnd"/>
+      <w:r>
+        <w:t>[</w:t>
+      </w:r>
+      <w:proofErr w:type="gramEnd"/>
+      <w:r>
+        <w:t>])</w:t>
       </w:r>
     </w:p>
     <w:p>
@@ -7584,52 +8744,146 @@
     </w:p>
     <w:p>
       <w:r>
-        <w:t>        Scanner sc = new Scanner(System.in);</w:t>
-      </w:r>
-    </w:p>
-    <w:p>
-      <w:r>
-        <w:t>        System.out.print("Enter first number: ");</w:t>
-      </w:r>
-    </w:p>
-    <w:p>
-      <w:r>
-        <w:t>        int num1 = sc.nextInt();</w:t>
-      </w:r>
-    </w:p>
-    <w:p>
-      <w:r>
-        <w:t>        System.out.print("Enter second number: ");</w:t>
-      </w:r>
-    </w:p>
-    <w:p>
-      <w:r>
-        <w:t>        int num2 = sc.nextInt();</w:t>
-      </w:r>
-    </w:p>
-    <w:p>
-      <w:r>
-        <w:t>        System.out.println("Addition: " + (num1 + num2));</w:t>
-      </w:r>
-    </w:p>
-    <w:p>
-      <w:r>
-        <w:t>        System.out.println("Subtraction: " + (num1 - num2));</w:t>
-      </w:r>
-    </w:p>
-    <w:p>
-      <w:r>
-        <w:t>        System.out.println("Multiplication: " + (num1 * num2));</w:t>
-      </w:r>
-    </w:p>
-    <w:p>
-      <w:r>
-        <w:t>        System.out.println("Division: " + (num1 / num2));</w:t>
-      </w:r>
-    </w:p>
-    <w:p>
-      <w:r>
-        <w:t>        sc.close();</w:t>
+        <w:t xml:space="preserve">        Scanner </w:t>
+      </w:r>
+      <w:proofErr w:type="spellStart"/>
+      <w:r>
+        <w:t>sc</w:t>
+      </w:r>
+      <w:proofErr w:type="spellEnd"/>
+      <w:r>
+        <w:t xml:space="preserve"> = new </w:t>
+      </w:r>
+      <w:proofErr w:type="gramStart"/>
+      <w:r>
+        <w:t>Scanner(</w:t>
+      </w:r>
+      <w:proofErr w:type="gramEnd"/>
+      <w:r>
+        <w:t>System.in);</w:t>
+      </w:r>
+    </w:p>
+    <w:p>
+      <w:r>
+        <w:t xml:space="preserve">        </w:t>
+      </w:r>
+      <w:proofErr w:type="spellStart"/>
+      <w:r>
+        <w:t>System.out.print</w:t>
+      </w:r>
+      <w:proofErr w:type="spellEnd"/>
+      <w:r>
+        <w:t>("Enter first number: ");</w:t>
+      </w:r>
+    </w:p>
+    <w:p>
+      <w:r>
+        <w:t xml:space="preserve">        int num1 = </w:t>
+      </w:r>
+      <w:proofErr w:type="spellStart"/>
+      <w:proofErr w:type="gramStart"/>
+      <w:r>
+        <w:t>sc.nextInt</w:t>
+      </w:r>
+      <w:proofErr w:type="spellEnd"/>
+      <w:proofErr w:type="gramEnd"/>
+      <w:r>
+        <w:t>();</w:t>
+      </w:r>
+    </w:p>
+    <w:p>
+      <w:r>
+        <w:t xml:space="preserve">        </w:t>
+      </w:r>
+      <w:proofErr w:type="spellStart"/>
+      <w:r>
+        <w:t>System.out.print</w:t>
+      </w:r>
+      <w:proofErr w:type="spellEnd"/>
+      <w:r>
+        <w:t>("Enter second number: ");</w:t>
+      </w:r>
+    </w:p>
+    <w:p>
+      <w:r>
+        <w:t xml:space="preserve">        int num2 = </w:t>
+      </w:r>
+      <w:proofErr w:type="spellStart"/>
+      <w:proofErr w:type="gramStart"/>
+      <w:r>
+        <w:t>sc.nextInt</w:t>
+      </w:r>
+      <w:proofErr w:type="spellEnd"/>
+      <w:proofErr w:type="gramEnd"/>
+      <w:r>
+        <w:t>();</w:t>
+      </w:r>
+    </w:p>
+    <w:p>
+      <w:r>
+        <w:t xml:space="preserve">        </w:t>
+      </w:r>
+      <w:proofErr w:type="spellStart"/>
+      <w:r>
+        <w:t>System.out.println</w:t>
+      </w:r>
+      <w:proofErr w:type="spellEnd"/>
+      <w:r>
+        <w:t>("Addition: " + (num1 + num2));</w:t>
+      </w:r>
+    </w:p>
+    <w:p>
+      <w:r>
+        <w:t xml:space="preserve">        </w:t>
+      </w:r>
+      <w:proofErr w:type="spellStart"/>
+      <w:r>
+        <w:t>System.out.println</w:t>
+      </w:r>
+      <w:proofErr w:type="spellEnd"/>
+      <w:r>
+        <w:t>("Subtraction: " + (num1 - num2));</w:t>
+      </w:r>
+    </w:p>
+    <w:p>
+      <w:r>
+        <w:t xml:space="preserve">        </w:t>
+      </w:r>
+      <w:proofErr w:type="spellStart"/>
+      <w:r>
+        <w:t>System.out.println</w:t>
+      </w:r>
+      <w:proofErr w:type="spellEnd"/>
+      <w:r>
+        <w:t>("Multiplication: " + (num1 * num2));</w:t>
+      </w:r>
+    </w:p>
+    <w:p>
+      <w:r>
+        <w:t xml:space="preserve">        </w:t>
+      </w:r>
+      <w:proofErr w:type="spellStart"/>
+      <w:r>
+        <w:t>System.out.println</w:t>
+      </w:r>
+      <w:proofErr w:type="spellEnd"/>
+      <w:r>
+        <w:t>("Division: " + (num1 / num2));</w:t>
+      </w:r>
+    </w:p>
+    <w:p>
+      <w:r>
+        <w:t xml:space="preserve">        </w:t>
+      </w:r>
+      <w:proofErr w:type="spellStart"/>
+      <w:proofErr w:type="gramStart"/>
+      <w:r>
+        <w:t>sc.close</w:t>
+      </w:r>
+      <w:proofErr w:type="spellEnd"/>
+      <w:proofErr w:type="gramEnd"/>
+      <w:r>
+        <w:t>();</w:t>
       </w:r>
     </w:p>
     <w:p>
@@ -7796,8 +9050,13 @@
     </w:p>
     <w:p>
       <w:r>
-        <w:t>class ForLoop</w:t>
-      </w:r>
+        <w:t xml:space="preserve">class </w:t>
+      </w:r>
+      <w:proofErr w:type="spellStart"/>
+      <w:r>
+        <w:t>ForLoop</w:t>
+      </w:r>
+      <w:proofErr w:type="spellEnd"/>
     </w:p>
     <w:p>
       <w:r>
@@ -7806,7 +9065,23 @@
     </w:p>
     <w:p>
       <w:r>
-        <w:t>    public static void main(String[] args)</w:t>
+        <w:t xml:space="preserve">    public static void </w:t>
+      </w:r>
+      <w:proofErr w:type="gramStart"/>
+      <w:r>
+        <w:t>main(String[</w:t>
+      </w:r>
+      <w:proofErr w:type="gramEnd"/>
+      <w:r>
+        <w:t xml:space="preserve">] </w:t>
+      </w:r>
+      <w:proofErr w:type="spellStart"/>
+      <w:r>
+        <w:t>args</w:t>
+      </w:r>
+      <w:proofErr w:type="spellEnd"/>
+      <w:r>
+        <w:t>)</w:t>
       </w:r>
     </w:p>
     <w:p>
@@ -7816,7 +9091,39 @@
     </w:p>
     <w:p>
       <w:r>
-        <w:t>        for(int i = 1; i &lt;= 10; i++)</w:t>
+        <w:t xml:space="preserve">        </w:t>
+      </w:r>
+      <w:proofErr w:type="gramStart"/>
+      <w:r>
+        <w:t>for(</w:t>
+      </w:r>
+      <w:proofErr w:type="gramEnd"/>
+      <w:r>
+        <w:t xml:space="preserve">int </w:t>
+      </w:r>
+      <w:proofErr w:type="spellStart"/>
+      <w:r>
+        <w:t>i</w:t>
+      </w:r>
+      <w:proofErr w:type="spellEnd"/>
+      <w:r>
+        <w:t xml:space="preserve"> = 1; </w:t>
+      </w:r>
+      <w:proofErr w:type="spellStart"/>
+      <w:r>
+        <w:t>i</w:t>
+      </w:r>
+      <w:proofErr w:type="spellEnd"/>
+      <w:r>
+        <w:t xml:space="preserve"> &lt;= 10; </w:t>
+      </w:r>
+      <w:proofErr w:type="spellStart"/>
+      <w:r>
+        <w:t>i</w:t>
+      </w:r>
+      <w:proofErr w:type="spellEnd"/>
+      <w:r>
+        <w:t>++)</w:t>
       </w:r>
     </w:p>
     <w:p>
@@ -7826,7 +9133,23 @@
     </w:p>
     <w:p>
       <w:r>
-        <w:t>            System.out.println(i + " ");</w:t>
+        <w:t xml:space="preserve">            </w:t>
+      </w:r>
+      <w:proofErr w:type="spellStart"/>
+      <w:r>
+        <w:t>System.out.println</w:t>
+      </w:r>
+      <w:proofErr w:type="spellEnd"/>
+      <w:r>
+        <w:t>(</w:t>
+      </w:r>
+      <w:proofErr w:type="spellStart"/>
+      <w:r>
+        <w:t>i</w:t>
+      </w:r>
+      <w:proofErr w:type="spellEnd"/>
+      <w:r>
+        <w:t xml:space="preserve"> + " ");</w:t>
       </w:r>
     </w:p>
     <w:p>
@@ -7940,7 +9263,23 @@
           <w:b/>
           <w:bCs/>
         </w:rPr>
-        <w:t>2. Enhanced ForLoop (For reach)</w:t>
+        <w:t xml:space="preserve">2. Enhanced </w:t>
+      </w:r>
+      <w:proofErr w:type="spellStart"/>
+      <w:r>
+        <w:rPr>
+          <w:b/>
+          <w:bCs/>
+        </w:rPr>
+        <w:t>ForLoop</w:t>
+      </w:r>
+      <w:proofErr w:type="spellEnd"/>
+      <w:r>
+        <w:rPr>
+          <w:b/>
+          <w:bCs/>
+        </w:rPr>
+        <w:t xml:space="preserve"> (For reach)</w:t>
       </w:r>
     </w:p>
     <w:p>
@@ -7960,8 +9299,13 @@
     </w:p>
     <w:p>
       <w:r>
-        <w:t>class EnhancedForLoop</w:t>
-      </w:r>
+        <w:t xml:space="preserve">class </w:t>
+      </w:r>
+      <w:proofErr w:type="spellStart"/>
+      <w:r>
+        <w:t>EnhancedForLoop</w:t>
+      </w:r>
+      <w:proofErr w:type="spellEnd"/>
     </w:p>
     <w:p>
       <w:r>
@@ -7970,7 +9314,23 @@
     </w:p>
     <w:p>
       <w:r>
-        <w:t>    public static void main(String[] args)</w:t>
+        <w:t xml:space="preserve">    public static void </w:t>
+      </w:r>
+      <w:proofErr w:type="gramStart"/>
+      <w:r>
+        <w:t>main(String[</w:t>
+      </w:r>
+      <w:proofErr w:type="gramEnd"/>
+      <w:r>
+        <w:t xml:space="preserve">] </w:t>
+      </w:r>
+      <w:proofErr w:type="spellStart"/>
+      <w:r>
+        <w:t>args</w:t>
+      </w:r>
+      <w:proofErr w:type="spellEnd"/>
+      <w:r>
+        <w:t>)</w:t>
       </w:r>
     </w:p>
     <w:p>
@@ -7980,17 +9340,41 @@
     </w:p>
     <w:p>
       <w:r>
-        <w:t>        int[] numbers = {1, 2, 3, 4, 5};</w:t>
-      </w:r>
-    </w:p>
-    <w:p>
-      <w:r>
         <w:t xml:space="preserve">        </w:t>
       </w:r>
-    </w:p>
-    <w:p>
-      <w:r>
-        <w:t>        for(int num : numbers)</w:t>
+      <w:proofErr w:type="gramStart"/>
+      <w:r>
+        <w:t>int[</w:t>
+      </w:r>
+      <w:proofErr w:type="gramEnd"/>
+      <w:r>
+        <w:t>] numbers = {1, 2, 3, 4, 5};</w:t>
+      </w:r>
+    </w:p>
+    <w:p>
+      <w:r>
+        <w:t xml:space="preserve">        </w:t>
+      </w:r>
+    </w:p>
+    <w:p>
+      <w:r>
+        <w:t xml:space="preserve">        </w:t>
+      </w:r>
+      <w:proofErr w:type="gramStart"/>
+      <w:r>
+        <w:t>for(</w:t>
+      </w:r>
+      <w:proofErr w:type="gramEnd"/>
+      <w:r>
+        <w:t xml:space="preserve">int </w:t>
+      </w:r>
+      <w:proofErr w:type="gramStart"/>
+      <w:r>
+        <w:t>num :</w:t>
+      </w:r>
+      <w:proofErr w:type="gramEnd"/>
+      <w:r>
+        <w:t xml:space="preserve"> numbers)</w:t>
       </w:r>
     </w:p>
     <w:p>
@@ -8000,7 +9384,15 @@
     </w:p>
     <w:p>
       <w:r>
-        <w:t>            System.out.println(num);</w:t>
+        <w:t xml:space="preserve">            </w:t>
+      </w:r>
+      <w:proofErr w:type="spellStart"/>
+      <w:r>
+        <w:t>System.out.println</w:t>
+      </w:r>
+      <w:proofErr w:type="spellEnd"/>
+      <w:r>
+        <w:t>(num);</w:t>
       </w:r>
     </w:p>
     <w:p>
@@ -8075,8 +9467,13 @@
     </w:p>
     <w:p>
       <w:r>
-        <w:t>class WhileLoop</w:t>
-      </w:r>
+        <w:t xml:space="preserve">class </w:t>
+      </w:r>
+      <w:proofErr w:type="spellStart"/>
+      <w:r>
+        <w:t>WhileLoop</w:t>
+      </w:r>
+      <w:proofErr w:type="spellEnd"/>
     </w:p>
     <w:p>
       <w:r>
@@ -8085,7 +9482,23 @@
     </w:p>
     <w:p>
       <w:r>
-        <w:t>    public static void main(String[] args)</w:t>
+        <w:t xml:space="preserve">    public static void </w:t>
+      </w:r>
+      <w:proofErr w:type="gramStart"/>
+      <w:r>
+        <w:t>main(String[</w:t>
+      </w:r>
+      <w:proofErr w:type="gramEnd"/>
+      <w:r>
+        <w:t xml:space="preserve">] </w:t>
+      </w:r>
+      <w:proofErr w:type="spellStart"/>
+      <w:r>
+        <w:t>args</w:t>
+      </w:r>
+      <w:proofErr w:type="spellEnd"/>
+      <w:r>
+        <w:t>)</w:t>
       </w:r>
     </w:p>
     <w:p>
@@ -8095,12 +9508,33 @@
     </w:p>
     <w:p>
       <w:r>
-        <w:t>            int i = 1;</w:t>
-      </w:r>
-    </w:p>
-    <w:p>
-      <w:r>
-        <w:t>            while(i &lt;= 10)</w:t>
+        <w:t xml:space="preserve">            int </w:t>
+      </w:r>
+      <w:proofErr w:type="spellStart"/>
+      <w:r>
+        <w:t>i</w:t>
+      </w:r>
+      <w:proofErr w:type="spellEnd"/>
+      <w:r>
+        <w:t xml:space="preserve"> = 1;</w:t>
+      </w:r>
+    </w:p>
+    <w:p>
+      <w:r>
+        <w:t xml:space="preserve">            </w:t>
+      </w:r>
+      <w:proofErr w:type="gramStart"/>
+      <w:r>
+        <w:t>while(</w:t>
+      </w:r>
+      <w:proofErr w:type="spellStart"/>
+      <w:proofErr w:type="gramEnd"/>
+      <w:r>
+        <w:t>i</w:t>
+      </w:r>
+      <w:proofErr w:type="spellEnd"/>
+      <w:r>
+        <w:t xml:space="preserve"> &lt;= 10)</w:t>
       </w:r>
     </w:p>
     <w:p>
@@ -8110,12 +9544,36 @@
     </w:p>
     <w:p>
       <w:r>
-        <w:t>                System.out.println(i + " ");</w:t>
-      </w:r>
-    </w:p>
-    <w:p>
-      <w:r>
-        <w:t>                i++;</w:t>
+        <w:t xml:space="preserve">                </w:t>
+      </w:r>
+      <w:proofErr w:type="spellStart"/>
+      <w:r>
+        <w:t>System.out.println</w:t>
+      </w:r>
+      <w:proofErr w:type="spellEnd"/>
+      <w:r>
+        <w:t>(</w:t>
+      </w:r>
+      <w:proofErr w:type="spellStart"/>
+      <w:r>
+        <w:t>i</w:t>
+      </w:r>
+      <w:proofErr w:type="spellEnd"/>
+      <w:r>
+        <w:t xml:space="preserve"> + " ");</w:t>
+      </w:r>
+    </w:p>
+    <w:p>
+      <w:r>
+        <w:t xml:space="preserve">                </w:t>
+      </w:r>
+      <w:proofErr w:type="spellStart"/>
+      <w:r>
+        <w:t>i</w:t>
+      </w:r>
+      <w:proofErr w:type="spellEnd"/>
+      <w:r>
+        <w:t>++;</w:t>
       </w:r>
     </w:p>
     <w:p>
@@ -8293,8 +9751,13 @@
     </w:p>
     <w:p>
       <w:r>
-        <w:t>class DoWhileLoop</w:t>
-      </w:r>
+        <w:t xml:space="preserve">class </w:t>
+      </w:r>
+      <w:proofErr w:type="spellStart"/>
+      <w:r>
+        <w:t>DoWhileLoop</w:t>
+      </w:r>
+      <w:proofErr w:type="spellEnd"/>
     </w:p>
     <w:p>
       <w:r>
@@ -8303,7 +9766,23 @@
     </w:p>
     <w:p>
       <w:r>
-        <w:t>    public static void main(String[] args)</w:t>
+        <w:t xml:space="preserve">    public static void </w:t>
+      </w:r>
+      <w:proofErr w:type="gramStart"/>
+      <w:r>
+        <w:t>main(String[</w:t>
+      </w:r>
+      <w:proofErr w:type="gramEnd"/>
+      <w:r>
+        <w:t xml:space="preserve">] </w:t>
+      </w:r>
+      <w:proofErr w:type="spellStart"/>
+      <w:r>
+        <w:t>args</w:t>
+      </w:r>
+      <w:proofErr w:type="spellEnd"/>
+      <w:r>
+        <w:t>)</w:t>
       </w:r>
     </w:p>
     <w:p>
@@ -8313,7 +9792,15 @@
     </w:p>
     <w:p>
       <w:r>
-        <w:t>        int i = 1;</w:t>
+        <w:t xml:space="preserve">        int </w:t>
+      </w:r>
+      <w:proofErr w:type="spellStart"/>
+      <w:r>
+        <w:t>i</w:t>
+      </w:r>
+      <w:proofErr w:type="spellEnd"/>
+      <w:r>
+        <w:t xml:space="preserve"> = 1;</w:t>
       </w:r>
     </w:p>
     <w:p>
@@ -8328,17 +9815,54 @@
     </w:p>
     <w:p>
       <w:r>
-        <w:t>            System.out.println(i + " ");</w:t>
-      </w:r>
-    </w:p>
-    <w:p>
-      <w:r>
-        <w:t>            i++;</w:t>
-      </w:r>
-    </w:p>
-    <w:p>
-      <w:r>
-        <w:t>        } while(i &lt;= 10);</w:t>
+        <w:t xml:space="preserve">            </w:t>
+      </w:r>
+      <w:proofErr w:type="spellStart"/>
+      <w:r>
+        <w:t>System.out.println</w:t>
+      </w:r>
+      <w:proofErr w:type="spellEnd"/>
+      <w:r>
+        <w:t>(</w:t>
+      </w:r>
+      <w:proofErr w:type="spellStart"/>
+      <w:r>
+        <w:t>i</w:t>
+      </w:r>
+      <w:proofErr w:type="spellEnd"/>
+      <w:r>
+        <w:t xml:space="preserve"> + " ");</w:t>
+      </w:r>
+    </w:p>
+    <w:p>
+      <w:r>
+        <w:t xml:space="preserve">            </w:t>
+      </w:r>
+      <w:proofErr w:type="spellStart"/>
+      <w:r>
+        <w:t>i</w:t>
+      </w:r>
+      <w:proofErr w:type="spellEnd"/>
+      <w:r>
+        <w:t>++;</w:t>
+      </w:r>
+    </w:p>
+    <w:p>
+      <w:r>
+        <w:t xml:space="preserve">        } </w:t>
+      </w:r>
+      <w:proofErr w:type="gramStart"/>
+      <w:r>
+        <w:t>while(</w:t>
+      </w:r>
+      <w:proofErr w:type="spellStart"/>
+      <w:proofErr w:type="gramEnd"/>
+      <w:r>
+        <w:t>i</w:t>
+      </w:r>
+      <w:proofErr w:type="spellEnd"/>
+      <w:r>
+        <w:t xml:space="preserve"> &lt;= 10);</w:t>
       </w:r>
     </w:p>
     <w:p>
@@ -8463,7 +9987,15 @@
         <w:t xml:space="preserve">: - </w:t>
       </w:r>
       <w:r>
-        <w:t>Are one of the most fundamental data structures, that allows us to store multiple values of the same data type in a single variable. They are use for storing and managing collection of data</w:t>
+        <w:t xml:space="preserve">Are one of the most fundamental data structures, that allows us to store multiple values of the same data type in a single variable. They are </w:t>
+      </w:r>
+      <w:proofErr w:type="spellStart"/>
+      <w:r>
+        <w:t>use</w:t>
+      </w:r>
+      <w:proofErr w:type="spellEnd"/>
+      <w:r>
+        <w:t xml:space="preserve"> for storing and managing collection of data</w:t>
       </w:r>
       <w:r>
         <w:t xml:space="preserve"> </w:t>
@@ -8526,8 +10058,13 @@
     </w:p>
     <w:p>
       <w:r>
-        <w:t>public class ArrayDemo</w:t>
-      </w:r>
+        <w:t xml:space="preserve">public class </w:t>
+      </w:r>
+      <w:proofErr w:type="spellStart"/>
+      <w:r>
+        <w:t>ArrayDemo</w:t>
+      </w:r>
+      <w:proofErr w:type="spellEnd"/>
     </w:p>
     <w:p>
       <w:r>
@@ -8536,7 +10073,28 @@
     </w:p>
     <w:p>
       <w:r>
-        <w:t>    public static void main(String args[])</w:t>
+        <w:t xml:space="preserve">    public static void </w:t>
+      </w:r>
+      <w:proofErr w:type="gramStart"/>
+      <w:r>
+        <w:t>main(</w:t>
+      </w:r>
+      <w:proofErr w:type="gramEnd"/>
+      <w:r>
+        <w:t xml:space="preserve">String </w:t>
+      </w:r>
+      <w:proofErr w:type="spellStart"/>
+      <w:proofErr w:type="gramStart"/>
+      <w:r>
+        <w:t>args</w:t>
+      </w:r>
+      <w:proofErr w:type="spellEnd"/>
+      <w:r>
+        <w:t>[</w:t>
+      </w:r>
+      <w:proofErr w:type="gramEnd"/>
+      <w:r>
+        <w:t>])</w:t>
       </w:r>
     </w:p>
     <w:p>
@@ -8551,7 +10109,23 @@
     </w:p>
     <w:p>
       <w:r>
-        <w:t>        int[] arr = {1,2,3,4,5};</w:t>
+        <w:t xml:space="preserve">        </w:t>
+      </w:r>
+      <w:proofErr w:type="gramStart"/>
+      <w:r>
+        <w:t>int[</w:t>
+      </w:r>
+      <w:proofErr w:type="gramEnd"/>
+      <w:r>
+        <w:t xml:space="preserve">] </w:t>
+      </w:r>
+      <w:proofErr w:type="spellStart"/>
+      <w:r>
+        <w:t>arr</w:t>
+      </w:r>
+      <w:proofErr w:type="spellEnd"/>
+      <w:r>
+        <w:t xml:space="preserve"> = {1,2,3,4,5};</w:t>
       </w:r>
     </w:p>
     <w:p>
@@ -8561,7 +10135,17 @@
     </w:p>
     <w:p>
       <w:r>
-        <w:t>        int n = arr.length;</w:t>
+        <w:t xml:space="preserve">        int n = </w:t>
+      </w:r>
+      <w:proofErr w:type="spellStart"/>
+      <w:proofErr w:type="gramStart"/>
+      <w:r>
+        <w:t>arr.length</w:t>
+      </w:r>
+      <w:proofErr w:type="spellEnd"/>
+      <w:proofErr w:type="gramEnd"/>
+      <w:r>
+        <w:t>;</w:t>
       </w:r>
     </w:p>
     <w:p>
@@ -8571,17 +10155,39 @@
     </w:p>
     <w:p>
       <w:r>
-        <w:t>        for(int i = 0; i &lt; n; i++)</w:t>
-      </w:r>
-    </w:p>
-    <w:p>
-      <w:r>
         <w:t xml:space="preserve">        </w:t>
       </w:r>
-    </w:p>
-    <w:p>
-      <w:r>
-        <w:t>            System.out.println(arr[i] + " ");</w:t>
+      <w:proofErr w:type="gramStart"/>
+      <w:r>
+        <w:t>for(</w:t>
+      </w:r>
+      <w:proofErr w:type="gramEnd"/>
+      <w:r>
+        <w:t xml:space="preserve">int </w:t>
+      </w:r>
+      <w:proofErr w:type="spellStart"/>
+      <w:r>
+        <w:t>i</w:t>
+      </w:r>
+      <w:proofErr w:type="spellEnd"/>
+      <w:r>
+        <w:t xml:space="preserve"> = 0; </w:t>
+      </w:r>
+      <w:proofErr w:type="spellStart"/>
+      <w:r>
+        <w:t>i</w:t>
+      </w:r>
+      <w:proofErr w:type="spellEnd"/>
+      <w:r>
+        <w:t xml:space="preserve"> &lt; n; </w:t>
+      </w:r>
+      <w:proofErr w:type="spellStart"/>
+      <w:r>
+        <w:t>i</w:t>
+      </w:r>
+      <w:proofErr w:type="spellEnd"/>
+      <w:r>
+        <w:t>++)</w:t>
       </w:r>
     </w:p>
     <w:p>
@@ -8591,6 +10197,40 @@
     </w:p>
     <w:p>
       <w:r>
+        <w:t xml:space="preserve">            </w:t>
+      </w:r>
+      <w:proofErr w:type="spellStart"/>
+      <w:r>
+        <w:t>System.out.println</w:t>
+      </w:r>
+      <w:proofErr w:type="spellEnd"/>
+      <w:r>
+        <w:t>(</w:t>
+      </w:r>
+      <w:proofErr w:type="spellStart"/>
+      <w:r>
+        <w:t>arr</w:t>
+      </w:r>
+      <w:proofErr w:type="spellEnd"/>
+      <w:r>
+        <w:t>[</w:t>
+      </w:r>
+      <w:proofErr w:type="spellStart"/>
+      <w:r>
+        <w:t>i</w:t>
+      </w:r>
+      <w:proofErr w:type="spellEnd"/>
+      <w:r>
+        <w:t>] + " ");</w:t>
+      </w:r>
+    </w:p>
+    <w:p>
+      <w:r>
+        <w:t xml:space="preserve">        </w:t>
+      </w:r>
+    </w:p>
+    <w:p>
+      <w:r>
         <w:t>    }</w:t>
       </w:r>
     </w:p>
@@ -8602,8 +10242,13 @@
     <w:p/>
     <w:p>
       <w:r>
-        <w:t>Types of arrays in java :</w:t>
-      </w:r>
+        <w:t xml:space="preserve">Types of arrays in </w:t>
+      </w:r>
+      <w:proofErr w:type="gramStart"/>
+      <w:r>
+        <w:t>java :</w:t>
+      </w:r>
+      <w:proofErr w:type="gramEnd"/>
     </w:p>
     <w:p>
       <w:r>
@@ -8682,8 +10327,13 @@
     </w:p>
     <w:p>
       <w:r>
-        <w:t>public class arraysumm</w:t>
-      </w:r>
+        <w:t xml:space="preserve">public class </w:t>
+      </w:r>
+      <w:proofErr w:type="spellStart"/>
+      <w:r>
+        <w:t>arraysumm</w:t>
+      </w:r>
+      <w:proofErr w:type="spellEnd"/>
     </w:p>
     <w:p>
       <w:r>
@@ -8692,7 +10342,28 @@
     </w:p>
     <w:p>
       <w:r>
-        <w:t>    public static void main(String args[])</w:t>
+        <w:t xml:space="preserve">    public static void </w:t>
+      </w:r>
+      <w:proofErr w:type="gramStart"/>
+      <w:r>
+        <w:t>main(</w:t>
+      </w:r>
+      <w:proofErr w:type="gramEnd"/>
+      <w:r>
+        <w:t xml:space="preserve">String </w:t>
+      </w:r>
+      <w:proofErr w:type="spellStart"/>
+      <w:proofErr w:type="gramStart"/>
+      <w:r>
+        <w:t>args</w:t>
+      </w:r>
+      <w:proofErr w:type="spellEnd"/>
+      <w:r>
+        <w:t>[</w:t>
+      </w:r>
+      <w:proofErr w:type="gramEnd"/>
+      <w:r>
+        <w:t>])</w:t>
       </w:r>
     </w:p>
     <w:p>
@@ -8702,7 +10373,23 @@
     </w:p>
     <w:p>
       <w:r>
-        <w:t>        int[] arr = {1,2,3,4,5};</w:t>
+        <w:t xml:space="preserve">        </w:t>
+      </w:r>
+      <w:proofErr w:type="gramStart"/>
+      <w:r>
+        <w:t>int[</w:t>
+      </w:r>
+      <w:proofErr w:type="gramEnd"/>
+      <w:r>
+        <w:t xml:space="preserve">] </w:t>
+      </w:r>
+      <w:proofErr w:type="spellStart"/>
+      <w:r>
+        <w:t>arr</w:t>
+      </w:r>
+      <w:proofErr w:type="spellEnd"/>
+      <w:r>
+        <w:t xml:space="preserve"> = {1,2,3,4,5};</w:t>
       </w:r>
     </w:p>
     <w:p>
@@ -8712,7 +10399,41 @@
     </w:p>
     <w:p>
       <w:r>
-        <w:t>        for (int i=0; i &lt; arr.length; i++)</w:t>
+        <w:t xml:space="preserve">        for (int </w:t>
+      </w:r>
+      <w:proofErr w:type="spellStart"/>
+      <w:r>
+        <w:t>i</w:t>
+      </w:r>
+      <w:proofErr w:type="spellEnd"/>
+      <w:r>
+        <w:t xml:space="preserve">=0; </w:t>
+      </w:r>
+      <w:proofErr w:type="spellStart"/>
+      <w:r>
+        <w:t>i</w:t>
+      </w:r>
+      <w:proofErr w:type="spellEnd"/>
+      <w:r>
+        <w:t xml:space="preserve"> &lt; </w:t>
+      </w:r>
+      <w:proofErr w:type="spellStart"/>
+      <w:proofErr w:type="gramStart"/>
+      <w:r>
+        <w:t>arr.length</w:t>
+      </w:r>
+      <w:proofErr w:type="spellEnd"/>
+      <w:proofErr w:type="gramEnd"/>
+      <w:r>
+        <w:t xml:space="preserve">; </w:t>
+      </w:r>
+      <w:proofErr w:type="spellStart"/>
+      <w:r>
+        <w:t>i</w:t>
+      </w:r>
+      <w:proofErr w:type="spellEnd"/>
+      <w:r>
+        <w:t>++)</w:t>
       </w:r>
     </w:p>
     <w:p>
@@ -8722,7 +10443,23 @@
     </w:p>
     <w:p>
       <w:r>
-        <w:t>            sum = sum + arr[i];</w:t>
+        <w:t xml:space="preserve">            sum = sum + </w:t>
+      </w:r>
+      <w:proofErr w:type="spellStart"/>
+      <w:r>
+        <w:t>arr</w:t>
+      </w:r>
+      <w:proofErr w:type="spellEnd"/>
+      <w:r>
+        <w:t>[</w:t>
+      </w:r>
+      <w:proofErr w:type="spellStart"/>
+      <w:r>
+        <w:t>i</w:t>
+      </w:r>
+      <w:proofErr w:type="spellEnd"/>
+      <w:r>
+        <w:t>];</w:t>
       </w:r>
     </w:p>
     <w:p>
@@ -8732,7 +10469,23 @@
     </w:p>
     <w:p>
       <w:r>
-        <w:t>        System.out.println("sum of ele is: " + sum);</w:t>
+        <w:t xml:space="preserve">        </w:t>
+      </w:r>
+      <w:proofErr w:type="spellStart"/>
+      <w:r>
+        <w:t>System.out.println</w:t>
+      </w:r>
+      <w:proofErr w:type="spellEnd"/>
+      <w:r>
+        <w:t xml:space="preserve">("sum of </w:t>
+      </w:r>
+      <w:proofErr w:type="spellStart"/>
+      <w:r>
+        <w:t>ele</w:t>
+      </w:r>
+      <w:proofErr w:type="spellEnd"/>
+      <w:r>
+        <w:t xml:space="preserve"> is: " + sum);</w:t>
       </w:r>
     </w:p>
     <w:p>
@@ -8908,13 +10661,1226 @@
           <w:bCs/>
         </w:rPr>
       </w:pPr>
-      <w:r>
-        <w:rPr>
-          <w:b/>
-          <w:bCs/>
-        </w:rPr>
-        <w:t>I’m making my own ai lollll</w:t>
-      </w:r>
+    </w:p>
+    <w:p>
+      <w:pPr>
+        <w:rPr>
+          <w:b/>
+          <w:bCs/>
+        </w:rPr>
+      </w:pPr>
+    </w:p>
+    <w:p>
+      <w:r>
+        <w:rPr>
+          <w:b/>
+          <w:bCs/>
+        </w:rPr>
+        <w:t>Polymorphism in java</w:t>
+      </w:r>
+      <w:r>
+        <w:rPr>
+          <w:b/>
+          <w:bCs/>
+        </w:rPr>
+        <w:br/>
+      </w:r>
+      <w:r>
+        <w:rPr>
+          <w:b/>
+          <w:bCs/>
+        </w:rPr>
+        <w:br/>
+      </w:r>
+      <w:r>
+        <w:t>Is a concept by which we can pe</w:t>
+      </w:r>
+      <w:r>
+        <w:t>r</w:t>
+      </w:r>
+      <w:r>
+        <w:t>f</w:t>
+      </w:r>
+      <w:r>
+        <w:t>orm</w:t>
+      </w:r>
+      <w:r>
+        <w:t xml:space="preserve"> a single action in different ways</w:t>
+      </w:r>
+    </w:p>
+    <w:p>
+      <w:r>
+        <w:t>There are two types</w:t>
+      </w:r>
+      <w:r>
+        <w:t xml:space="preserve"> of polymorphism in Java: compile-time polymorphism and runtime polymorphism</w:t>
+      </w:r>
+      <w:r>
+        <w:t>. We can perform polymorphism in java by method overloading and method overloading.</w:t>
+      </w:r>
+    </w:p>
+    <w:p/>
+    <w:p>
+      <w:pPr>
+        <w:rPr>
+          <w:b/>
+          <w:bCs/>
+        </w:rPr>
+      </w:pPr>
+      <w:r>
+        <w:rPr>
+          <w:b/>
+          <w:bCs/>
+        </w:rPr>
+        <w:t xml:space="preserve">Runtime Polymorphism </w:t>
+      </w:r>
+      <w:r>
+        <w:rPr>
+          <w:b/>
+          <w:bCs/>
+        </w:rPr>
+        <w:t>in Java</w:t>
+      </w:r>
+    </w:p>
+    <w:p>
+      <w:r>
+        <w:rPr>
+          <w:b/>
+          <w:bCs/>
+        </w:rPr>
+        <w:t>Runtime Polymorphism</w:t>
+      </w:r>
+      <w:r>
+        <w:rPr>
+          <w:b/>
+          <w:bCs/>
+        </w:rPr>
+        <w:t xml:space="preserve"> </w:t>
+      </w:r>
+      <w:r>
+        <w:t xml:space="preserve">or </w:t>
+      </w:r>
+      <w:r>
+        <w:rPr>
+          <w:b/>
+          <w:bCs/>
+        </w:rPr>
+        <w:t xml:space="preserve">Dynamic Method Dispatch </w:t>
+      </w:r>
+      <w:r>
+        <w:t>is a process in which a call to an overridden method is resolved at runtime rather compile-time</w:t>
+      </w:r>
+      <w:r>
+        <w:t>.</w:t>
+      </w:r>
+    </w:p>
+    <w:p>
+      <w:r>
+        <w:t>In this process, an overridden method is called through the reference variable of a superclass</w:t>
+      </w:r>
+      <w:r>
+        <w:t>.</w:t>
+      </w:r>
+    </w:p>
+    <w:p/>
+    <w:p>
+      <w:pPr>
+        <w:rPr>
+          <w:b/>
+          <w:bCs/>
+        </w:rPr>
+      </w:pPr>
+      <w:r>
+        <w:rPr>
+          <w:b/>
+          <w:bCs/>
+        </w:rPr>
+        <w:t>Upcasting</w:t>
+      </w:r>
+    </w:p>
+    <w:p>
+      <w:r>
+        <w:t>If the reference variable of Parent class refers to the object of Child Class, it is known as upcasting.</w:t>
+      </w:r>
+    </w:p>
+    <w:p>
+      <w:r>
+        <w:rPr>
+          <w:b/>
+          <w:bCs/>
+        </w:rPr>
+        <w:t>Syntax</w:t>
+      </w:r>
+      <w:r>
+        <w:rPr>
+          <w:b/>
+          <w:bCs/>
+        </w:rPr>
+        <w:t>:</w:t>
+      </w:r>
+      <w:r>
+        <w:t xml:space="preserve"> - </w:t>
+      </w:r>
+    </w:p>
+    <w:p>
+      <w:r>
+        <w:t xml:space="preserve">class </w:t>
+      </w:r>
+      <w:proofErr w:type="gramStart"/>
+      <w:r>
+        <w:t>A{</w:t>
+      </w:r>
+      <w:proofErr w:type="gramEnd"/>
+      <w:r>
+        <w:t>}</w:t>
+      </w:r>
+    </w:p>
+    <w:p>
+      <w:r>
+        <w:t xml:space="preserve">class B extends </w:t>
+      </w:r>
+      <w:proofErr w:type="gramStart"/>
+      <w:r>
+        <w:t>A{</w:t>
+      </w:r>
+      <w:proofErr w:type="gramEnd"/>
+      <w:r>
+        <w:t>}</w:t>
+      </w:r>
+    </w:p>
+    <w:p>
+      <w:r>
+        <w:t xml:space="preserve">A a=new </w:t>
+      </w:r>
+      <w:proofErr w:type="gramStart"/>
+      <w:r>
+        <w:t>B(</w:t>
+      </w:r>
+      <w:proofErr w:type="gramEnd"/>
+      <w:r>
+        <w:t>); //Upcasting</w:t>
+      </w:r>
+    </w:p>
+    <w:p/>
+    <w:p>
+      <w:pPr>
+        <w:rPr>
+          <w:b/>
+          <w:bCs/>
+        </w:rPr>
+      </w:pPr>
+      <w:r>
+        <w:rPr>
+          <w:b/>
+          <w:bCs/>
+        </w:rPr>
+        <w:lastRenderedPageBreak/>
+        <w:t xml:space="preserve">Example </w:t>
+      </w:r>
+    </w:p>
+    <w:p>
+      <w:pPr>
+        <w:rPr>
+          <w:b/>
+          <w:bCs/>
+        </w:rPr>
+      </w:pPr>
+      <w:r>
+        <w:rPr>
+          <w:b/>
+          <w:bCs/>
+        </w:rPr>
+        <w:t xml:space="preserve">Code: - </w:t>
+      </w:r>
+    </w:p>
+    <w:p>
+      <w:r>
+        <w:t>class Bike</w:t>
+      </w:r>
+    </w:p>
+    <w:p>
+      <w:r>
+        <w:t xml:space="preserve">{ </w:t>
+      </w:r>
+    </w:p>
+    <w:p>
+      <w:r>
+        <w:tab/>
+        <w:t xml:space="preserve">void </w:t>
+      </w:r>
+      <w:proofErr w:type="gramStart"/>
+      <w:r>
+        <w:t>run(</w:t>
+      </w:r>
+      <w:proofErr w:type="gramEnd"/>
+      <w:r>
+        <w:t>)</w:t>
+      </w:r>
+    </w:p>
+    <w:p>
+      <w:r>
+        <w:tab/>
+        <w:t>{</w:t>
+      </w:r>
+    </w:p>
+    <w:p>
+      <w:r>
+        <w:tab/>
+      </w:r>
+      <w:r>
+        <w:tab/>
+      </w:r>
+      <w:proofErr w:type="spellStart"/>
+      <w:r>
+        <w:t>System.out.println</w:t>
+      </w:r>
+      <w:proofErr w:type="spellEnd"/>
+      <w:r>
+        <w:t>(“running”);</w:t>
+      </w:r>
+    </w:p>
+    <w:p>
+      <w:r>
+        <w:tab/>
+        <w:t>}</w:t>
+      </w:r>
+    </w:p>
+    <w:p>
+      <w:r>
+        <w:t>}</w:t>
+      </w:r>
+    </w:p>
+    <w:p>
+      <w:r>
+        <w:t>class Splendor extends Bike</w:t>
+      </w:r>
+    </w:p>
+    <w:p>
+      <w:r>
+        <w:t>{</w:t>
+      </w:r>
+    </w:p>
+    <w:p>
+      <w:r>
+        <w:tab/>
+        <w:t xml:space="preserve">void </w:t>
+      </w:r>
+      <w:proofErr w:type="gramStart"/>
+      <w:r>
+        <w:t>run(</w:t>
+      </w:r>
+      <w:proofErr w:type="gramEnd"/>
+      <w:r>
+        <w:t>)</w:t>
+      </w:r>
+    </w:p>
+    <w:p>
+      <w:r>
+        <w:t>{</w:t>
+      </w:r>
+    </w:p>
+    <w:p>
+      <w:r>
+        <w:tab/>
+      </w:r>
+      <w:proofErr w:type="spellStart"/>
+      <w:r>
+        <w:t>System.out.println</w:t>
+      </w:r>
+      <w:proofErr w:type="spellEnd"/>
+      <w:r>
+        <w:t>(“running</w:t>
+      </w:r>
+      <w:r>
+        <w:t xml:space="preserve"> safely with 60km/h</w:t>
+      </w:r>
+      <w:r>
+        <w:t>”);</w:t>
+      </w:r>
+    </w:p>
+    <w:p>
+      <w:r>
+        <w:t>}</w:t>
+      </w:r>
+    </w:p>
+    <w:p>
+      <w:r>
+        <w:t xml:space="preserve">public static void </w:t>
+      </w:r>
+      <w:proofErr w:type="gramStart"/>
+      <w:r>
+        <w:t>main(</w:t>
+      </w:r>
+      <w:proofErr w:type="gramEnd"/>
+      <w:r>
+        <w:t xml:space="preserve">String </w:t>
+      </w:r>
+      <w:proofErr w:type="spellStart"/>
+      <w:proofErr w:type="gramStart"/>
+      <w:r>
+        <w:t>args</w:t>
+      </w:r>
+      <w:proofErr w:type="spellEnd"/>
+      <w:r>
+        <w:t>[</w:t>
+      </w:r>
+      <w:proofErr w:type="gramEnd"/>
+      <w:r>
+        <w:t>])</w:t>
+      </w:r>
+    </w:p>
+    <w:p>
+      <w:r>
+        <w:t>{</w:t>
+      </w:r>
+    </w:p>
+    <w:p>
+      <w:r>
+        <w:tab/>
+        <w:t xml:space="preserve">Bike b = new </w:t>
+      </w:r>
+      <w:proofErr w:type="gramStart"/>
+      <w:r>
+        <w:t>Splendor(</w:t>
+      </w:r>
+      <w:proofErr w:type="gramEnd"/>
+      <w:r>
+        <w:t>); // upcasting</w:t>
+      </w:r>
+    </w:p>
+    <w:p>
+      <w:r>
+        <w:tab/>
+      </w:r>
+      <w:proofErr w:type="spellStart"/>
+      <w:proofErr w:type="gramStart"/>
+      <w:r>
+        <w:t>b.run</w:t>
+      </w:r>
+      <w:proofErr w:type="spellEnd"/>
+      <w:r>
+        <w:t>(</w:t>
+      </w:r>
+      <w:proofErr w:type="gramEnd"/>
+      <w:r>
+        <w:t>);</w:t>
+      </w:r>
+    </w:p>
+    <w:p>
+      <w:r>
+        <w:t>}</w:t>
+      </w:r>
+    </w:p>
+    <w:p>
+      <w:pPr>
+        <w:rPr>
+          <w:b/>
+          <w:bCs/>
+        </w:rPr>
+      </w:pPr>
+      <w:r>
+        <w:rPr>
+          <w:b/>
+          <w:bCs/>
+        </w:rPr>
+        <w:t xml:space="preserve">Output: - </w:t>
+      </w:r>
+    </w:p>
+    <w:p>
+      <w:pPr>
+        <w:rPr>
+          <w:b/>
+          <w:bCs/>
+        </w:rPr>
+      </w:pPr>
+    </w:p>
+    <w:p>
+      <w:pPr>
+        <w:rPr>
+          <w:b/>
+          <w:bCs/>
+        </w:rPr>
+      </w:pPr>
+    </w:p>
+    <w:p>
+      <w:pPr>
+        <w:rPr>
+          <w:b/>
+          <w:bCs/>
+        </w:rPr>
+      </w:pPr>
+    </w:p>
+    <w:p>
+      <w:pPr>
+        <w:rPr>
+          <w:b/>
+          <w:bCs/>
+        </w:rPr>
+      </w:pPr>
+    </w:p>
+    <w:p>
+      <w:pPr>
+        <w:rPr>
+          <w:b/>
+          <w:bCs/>
+        </w:rPr>
+      </w:pPr>
+    </w:p>
+    <w:p>
+      <w:pPr>
+        <w:rPr>
+          <w:b/>
+          <w:bCs/>
+        </w:rPr>
+      </w:pPr>
+      <w:r>
+        <w:rPr>
+          <w:b/>
+          <w:bCs/>
+        </w:rPr>
+        <w:lastRenderedPageBreak/>
+        <w:t xml:space="preserve">Example 2: - </w:t>
+      </w:r>
+    </w:p>
+    <w:p>
+      <w:r>
+        <w:t>class Bank</w:t>
+      </w:r>
+    </w:p>
+    <w:p>
+      <w:r>
+        <w:t>{</w:t>
+      </w:r>
+    </w:p>
+    <w:p>
+      <w:r>
+        <w:t xml:space="preserve">    float </w:t>
+      </w:r>
+      <w:proofErr w:type="spellStart"/>
+      <w:proofErr w:type="gramStart"/>
+      <w:r>
+        <w:t>getRateOfInterest</w:t>
+      </w:r>
+      <w:proofErr w:type="spellEnd"/>
+      <w:r>
+        <w:t>(</w:t>
+      </w:r>
+      <w:proofErr w:type="gramEnd"/>
+      <w:r>
+        <w:t>)</w:t>
+      </w:r>
+    </w:p>
+    <w:p>
+      <w:r>
+        <w:t xml:space="preserve">    {</w:t>
+      </w:r>
+    </w:p>
+    <w:p>
+      <w:r>
+        <w:t xml:space="preserve">        return 0;</w:t>
+      </w:r>
+    </w:p>
+    <w:p>
+      <w:r>
+        <w:t xml:space="preserve">    }</w:t>
+      </w:r>
+    </w:p>
+    <w:p>
+      <w:r>
+        <w:t>}</w:t>
+      </w:r>
+    </w:p>
+    <w:p/>
+    <w:p>
+      <w:r>
+        <w:t>class SBI extends Bank</w:t>
+      </w:r>
+    </w:p>
+    <w:p>
+      <w:r>
+        <w:t>{</w:t>
+      </w:r>
+    </w:p>
+    <w:p>
+      <w:r>
+        <w:t xml:space="preserve">    float </w:t>
+      </w:r>
+      <w:proofErr w:type="spellStart"/>
+      <w:proofErr w:type="gramStart"/>
+      <w:r>
+        <w:t>getRateOfInterest</w:t>
+      </w:r>
+      <w:proofErr w:type="spellEnd"/>
+      <w:r>
+        <w:t>(</w:t>
+      </w:r>
+      <w:proofErr w:type="gramEnd"/>
+      <w:r>
+        <w:t>)</w:t>
+      </w:r>
+    </w:p>
+    <w:p>
+      <w:r>
+        <w:t xml:space="preserve">    {</w:t>
+      </w:r>
+    </w:p>
+    <w:p>
+      <w:r>
+        <w:t xml:space="preserve">        return 6.5f;</w:t>
+      </w:r>
+    </w:p>
+    <w:p>
+      <w:r>
+        <w:t xml:space="preserve">    }</w:t>
+      </w:r>
+    </w:p>
+    <w:p>
+      <w:r>
+        <w:t>}</w:t>
+      </w:r>
+    </w:p>
+    <w:p/>
+    <w:p>
+      <w:r>
+        <w:t>class ICICI extends Bank</w:t>
+      </w:r>
+    </w:p>
+    <w:p>
+      <w:r>
+        <w:t>{</w:t>
+      </w:r>
+    </w:p>
+    <w:p>
+      <w:r>
+        <w:t xml:space="preserve">    float </w:t>
+      </w:r>
+      <w:proofErr w:type="spellStart"/>
+      <w:proofErr w:type="gramStart"/>
+      <w:r>
+        <w:t>getRateOfInterest</w:t>
+      </w:r>
+      <w:proofErr w:type="spellEnd"/>
+      <w:r>
+        <w:t>(</w:t>
+      </w:r>
+      <w:proofErr w:type="gramEnd"/>
+      <w:r>
+        <w:t>)</w:t>
+      </w:r>
+    </w:p>
+    <w:p>
+      <w:r>
+        <w:t xml:space="preserve">    {</w:t>
+      </w:r>
+    </w:p>
+    <w:p>
+      <w:r>
+        <w:t xml:space="preserve">        return 7.5f;</w:t>
+      </w:r>
+    </w:p>
+    <w:p>
+      <w:r>
+        <w:t xml:space="preserve">    }</w:t>
+      </w:r>
+    </w:p>
+    <w:p>
+      <w:r>
+        <w:t>}</w:t>
+      </w:r>
+    </w:p>
+    <w:p/>
+    <w:p>
+      <w:r>
+        <w:t>class Axis extends Bank</w:t>
+      </w:r>
+    </w:p>
+    <w:p>
+      <w:r>
+        <w:lastRenderedPageBreak/>
+        <w:t>{</w:t>
+      </w:r>
+    </w:p>
+    <w:p>
+      <w:r>
+        <w:t xml:space="preserve">    float </w:t>
+      </w:r>
+      <w:proofErr w:type="spellStart"/>
+      <w:proofErr w:type="gramStart"/>
+      <w:r>
+        <w:t>getRateOfInterest</w:t>
+      </w:r>
+      <w:proofErr w:type="spellEnd"/>
+      <w:r>
+        <w:t>(</w:t>
+      </w:r>
+      <w:proofErr w:type="gramEnd"/>
+      <w:r>
+        <w:t>)</w:t>
+      </w:r>
+    </w:p>
+    <w:p>
+      <w:r>
+        <w:t xml:space="preserve">    {</w:t>
+      </w:r>
+    </w:p>
+    <w:p>
+      <w:r>
+        <w:t xml:space="preserve">        return 9.7f;</w:t>
+      </w:r>
+    </w:p>
+    <w:p>
+      <w:r>
+        <w:t xml:space="preserve">    }</w:t>
+      </w:r>
+    </w:p>
+    <w:p>
+      <w:r>
+        <w:t>}</w:t>
+      </w:r>
+    </w:p>
+    <w:p/>
+    <w:p>
+      <w:r>
+        <w:t>public class Main</w:t>
+      </w:r>
+    </w:p>
+    <w:p>
+      <w:r>
+        <w:t>{</w:t>
+      </w:r>
+    </w:p>
+    <w:p>
+      <w:r>
+        <w:t xml:space="preserve">    public static void </w:t>
+      </w:r>
+      <w:proofErr w:type="gramStart"/>
+      <w:r>
+        <w:t>main(</w:t>
+      </w:r>
+      <w:proofErr w:type="gramEnd"/>
+      <w:r>
+        <w:t xml:space="preserve">String </w:t>
+      </w:r>
+      <w:proofErr w:type="spellStart"/>
+      <w:proofErr w:type="gramStart"/>
+      <w:r>
+        <w:t>args</w:t>
+      </w:r>
+      <w:proofErr w:type="spellEnd"/>
+      <w:r>
+        <w:t>[</w:t>
+      </w:r>
+      <w:proofErr w:type="gramEnd"/>
+      <w:r>
+        <w:t>])</w:t>
+      </w:r>
+    </w:p>
+    <w:p>
+      <w:r>
+        <w:t xml:space="preserve">    {</w:t>
+      </w:r>
+    </w:p>
+    <w:p>
+      <w:r>
+        <w:t xml:space="preserve">        Bank b;</w:t>
+      </w:r>
+    </w:p>
+    <w:p/>
+    <w:p>
+      <w:r>
+        <w:t xml:space="preserve">        b = new </w:t>
+      </w:r>
+      <w:proofErr w:type="gramStart"/>
+      <w:r>
+        <w:t>SBI(</w:t>
+      </w:r>
+      <w:proofErr w:type="gramEnd"/>
+      <w:r>
+        <w:t>);</w:t>
+      </w:r>
+    </w:p>
+    <w:p>
+      <w:r>
+        <w:t xml:space="preserve">        </w:t>
+      </w:r>
+      <w:proofErr w:type="spellStart"/>
+      <w:r>
+        <w:t>System.out.println</w:t>
+      </w:r>
+      <w:proofErr w:type="spellEnd"/>
+      <w:r>
+        <w:t xml:space="preserve">("SBI Rate of Interest: " + </w:t>
+      </w:r>
+      <w:proofErr w:type="spellStart"/>
+      <w:proofErr w:type="gramStart"/>
+      <w:r>
+        <w:t>b.getRateOfInterest</w:t>
+      </w:r>
+      <w:proofErr w:type="spellEnd"/>
+      <w:proofErr w:type="gramEnd"/>
+      <w:r>
+        <w:t>());</w:t>
+      </w:r>
+    </w:p>
+    <w:p/>
+    <w:p>
+      <w:r>
+        <w:t xml:space="preserve">        b = new </w:t>
+      </w:r>
+      <w:proofErr w:type="gramStart"/>
+      <w:r>
+        <w:t>ICICI(</w:t>
+      </w:r>
+      <w:proofErr w:type="gramEnd"/>
+      <w:r>
+        <w:t>);</w:t>
+      </w:r>
+    </w:p>
+    <w:p>
+      <w:r>
+        <w:t xml:space="preserve">        </w:t>
+      </w:r>
+      <w:proofErr w:type="spellStart"/>
+      <w:r>
+        <w:t>System.out.println</w:t>
+      </w:r>
+      <w:proofErr w:type="spellEnd"/>
+      <w:r>
+        <w:t xml:space="preserve">("ICICI Rate of Interest: " + </w:t>
+      </w:r>
+      <w:proofErr w:type="spellStart"/>
+      <w:proofErr w:type="gramStart"/>
+      <w:r>
+        <w:t>b.getRateOfInterest</w:t>
+      </w:r>
+      <w:proofErr w:type="spellEnd"/>
+      <w:proofErr w:type="gramEnd"/>
+      <w:r>
+        <w:t>());</w:t>
+      </w:r>
+    </w:p>
+    <w:p/>
+    <w:p>
+      <w:r>
+        <w:t xml:space="preserve">        b = new </w:t>
+      </w:r>
+      <w:proofErr w:type="gramStart"/>
+      <w:r>
+        <w:t>Axis(</w:t>
+      </w:r>
+      <w:proofErr w:type="gramEnd"/>
+      <w:r>
+        <w:t>);</w:t>
+      </w:r>
+    </w:p>
+    <w:p>
+      <w:r>
+        <w:t xml:space="preserve">        </w:t>
+      </w:r>
+      <w:proofErr w:type="spellStart"/>
+      <w:r>
+        <w:t>System.out.println</w:t>
+      </w:r>
+      <w:proofErr w:type="spellEnd"/>
+      <w:r>
+        <w:t xml:space="preserve">("Axis Rate of Interest: " + </w:t>
+      </w:r>
+      <w:proofErr w:type="spellStart"/>
+      <w:proofErr w:type="gramStart"/>
+      <w:r>
+        <w:t>b.getRateOfInterest</w:t>
+      </w:r>
+      <w:proofErr w:type="spellEnd"/>
+      <w:proofErr w:type="gramEnd"/>
+      <w:r>
+        <w:t>());</w:t>
+      </w:r>
+    </w:p>
+    <w:p>
+      <w:r>
+        <w:t xml:space="preserve">    }</w:t>
+      </w:r>
+    </w:p>
+    <w:p>
+      <w:r>
+        <w:t>}</w:t>
+      </w:r>
+    </w:p>
+    <w:p/>
+    <w:p/>
+    <w:p/>
+    <w:p>
+      <w:pPr>
+        <w:rPr>
+          <w:b/>
+          <w:bCs/>
+        </w:rPr>
+      </w:pPr>
+      <w:r>
+        <w:rPr>
+          <w:b/>
+          <w:bCs/>
+        </w:rPr>
+        <w:lastRenderedPageBreak/>
+        <w:t xml:space="preserve">Example 3: - </w:t>
+      </w:r>
+    </w:p>
+    <w:p>
+      <w:r>
+        <w:t>class Shape</w:t>
+      </w:r>
+    </w:p>
+    <w:p>
+      <w:r>
+        <w:t>{</w:t>
+      </w:r>
+    </w:p>
+    <w:p>
+      <w:r>
+        <w:t xml:space="preserve">    void </w:t>
+      </w:r>
+      <w:proofErr w:type="gramStart"/>
+      <w:r>
+        <w:t>draw(</w:t>
+      </w:r>
+      <w:proofErr w:type="gramEnd"/>
+      <w:r>
+        <w:t>)</w:t>
+      </w:r>
+    </w:p>
+    <w:p>
+      <w:r>
+        <w:t xml:space="preserve">    {</w:t>
+      </w:r>
+    </w:p>
+    <w:p>
+      <w:r>
+        <w:t xml:space="preserve">        </w:t>
+      </w:r>
+      <w:proofErr w:type="spellStart"/>
+      <w:r>
+        <w:t>System.out.println</w:t>
+      </w:r>
+      <w:proofErr w:type="spellEnd"/>
+      <w:r>
+        <w:t>("Drawing shape...");</w:t>
+      </w:r>
+    </w:p>
+    <w:p>
+      <w:r>
+        <w:t xml:space="preserve">    }</w:t>
+      </w:r>
+    </w:p>
+    <w:p>
+      <w:r>
+        <w:t>}</w:t>
+      </w:r>
+    </w:p>
+    <w:p/>
+    <w:p>
+      <w:r>
+        <w:t>class Rectangle extends Shape</w:t>
+      </w:r>
+    </w:p>
+    <w:p>
+      <w:r>
+        <w:t>{</w:t>
+      </w:r>
+    </w:p>
+    <w:p>
+      <w:r>
+        <w:t xml:space="preserve">    void </w:t>
+      </w:r>
+      <w:proofErr w:type="gramStart"/>
+      <w:r>
+        <w:t>draw(</w:t>
+      </w:r>
+      <w:proofErr w:type="gramEnd"/>
+      <w:r>
+        <w:t>)</w:t>
+      </w:r>
+    </w:p>
+    <w:p>
+      <w:r>
+        <w:t xml:space="preserve">    {</w:t>
+      </w:r>
+    </w:p>
+    <w:p>
+      <w:r>
+        <w:t xml:space="preserve">        </w:t>
+      </w:r>
+      <w:proofErr w:type="spellStart"/>
+      <w:r>
+        <w:t>System.out.println</w:t>
+      </w:r>
+      <w:proofErr w:type="spellEnd"/>
+      <w:r>
+        <w:t>("Drawing rectangle...");</w:t>
+      </w:r>
+    </w:p>
+    <w:p>
+      <w:r>
+        <w:t xml:space="preserve">    }</w:t>
+      </w:r>
+    </w:p>
+    <w:p>
+      <w:r>
+        <w:t>}</w:t>
+      </w:r>
+    </w:p>
+    <w:p/>
+    <w:p>
+      <w:r>
+        <w:t>class Circle extends Shape</w:t>
+      </w:r>
+    </w:p>
+    <w:p>
+      <w:r>
+        <w:t>{</w:t>
+      </w:r>
+    </w:p>
+    <w:p>
+      <w:r>
+        <w:t xml:space="preserve">    void </w:t>
+      </w:r>
+      <w:proofErr w:type="gramStart"/>
+      <w:r>
+        <w:t>draw(</w:t>
+      </w:r>
+      <w:proofErr w:type="gramEnd"/>
+      <w:r>
+        <w:t>)</w:t>
+      </w:r>
+    </w:p>
+    <w:p>
+      <w:r>
+        <w:t xml:space="preserve">    {</w:t>
+      </w:r>
+    </w:p>
+    <w:p>
+      <w:r>
+        <w:t xml:space="preserve">        </w:t>
+      </w:r>
+      <w:proofErr w:type="spellStart"/>
+      <w:r>
+        <w:t>System.out.println</w:t>
+      </w:r>
+      <w:proofErr w:type="spellEnd"/>
+      <w:r>
+        <w:t>("Drawing circle...");</w:t>
+      </w:r>
+    </w:p>
+    <w:p>
+      <w:r>
+        <w:t xml:space="preserve">    }</w:t>
+      </w:r>
+    </w:p>
+    <w:p>
+      <w:r>
+        <w:t>}</w:t>
+      </w:r>
+    </w:p>
+    <w:p/>
+    <w:p>
+      <w:r>
+        <w:t>class Triangle extends Shape</w:t>
+      </w:r>
+    </w:p>
+    <w:p>
+      <w:r>
+        <w:lastRenderedPageBreak/>
+        <w:t>{</w:t>
+      </w:r>
+    </w:p>
+    <w:p>
+      <w:r>
+        <w:t xml:space="preserve">    void </w:t>
+      </w:r>
+      <w:proofErr w:type="gramStart"/>
+      <w:r>
+        <w:t>draw(</w:t>
+      </w:r>
+      <w:proofErr w:type="gramEnd"/>
+      <w:r>
+        <w:t>)</w:t>
+      </w:r>
+    </w:p>
+    <w:p>
+      <w:r>
+        <w:t xml:space="preserve">    {</w:t>
+      </w:r>
+    </w:p>
+    <w:p>
+      <w:r>
+        <w:t xml:space="preserve">        </w:t>
+      </w:r>
+      <w:proofErr w:type="spellStart"/>
+      <w:r>
+        <w:t>System.out.println</w:t>
+      </w:r>
+      <w:proofErr w:type="spellEnd"/>
+      <w:r>
+        <w:t>("Drawing triangle...");</w:t>
+      </w:r>
+    </w:p>
+    <w:p>
+      <w:r>
+        <w:t xml:space="preserve">    }</w:t>
+      </w:r>
+    </w:p>
+    <w:p>
+      <w:r>
+        <w:t>}</w:t>
+      </w:r>
+    </w:p>
+    <w:p/>
+    <w:p>
+      <w:r>
+        <w:t>class TestPolymorphism2</w:t>
+      </w:r>
+    </w:p>
+    <w:p>
+      <w:r>
+        <w:t>{</w:t>
+      </w:r>
+    </w:p>
+    <w:p>
+      <w:r>
+        <w:t xml:space="preserve">    public static void </w:t>
+      </w:r>
+      <w:proofErr w:type="gramStart"/>
+      <w:r>
+        <w:t>main(</w:t>
+      </w:r>
+      <w:proofErr w:type="gramEnd"/>
+      <w:r>
+        <w:t xml:space="preserve">String </w:t>
+      </w:r>
+      <w:proofErr w:type="spellStart"/>
+      <w:proofErr w:type="gramStart"/>
+      <w:r>
+        <w:t>args</w:t>
+      </w:r>
+      <w:proofErr w:type="spellEnd"/>
+      <w:r>
+        <w:t>[</w:t>
+      </w:r>
+      <w:proofErr w:type="gramEnd"/>
+      <w:r>
+        <w:t>])</w:t>
+      </w:r>
+    </w:p>
+    <w:p>
+      <w:r>
+        <w:t xml:space="preserve">    {</w:t>
+      </w:r>
+    </w:p>
+    <w:p>
+      <w:r>
+        <w:t xml:space="preserve">        Shape s;</w:t>
+      </w:r>
+    </w:p>
+    <w:p/>
+    <w:p>
+      <w:r>
+        <w:t xml:space="preserve">        s = new </w:t>
+      </w:r>
+      <w:proofErr w:type="gramStart"/>
+      <w:r>
+        <w:t>Rectangle(</w:t>
+      </w:r>
+      <w:proofErr w:type="gramEnd"/>
+      <w:r>
+        <w:t>);</w:t>
+      </w:r>
+    </w:p>
+    <w:p>
+      <w:r>
+        <w:t xml:space="preserve">        </w:t>
+      </w:r>
+      <w:proofErr w:type="spellStart"/>
+      <w:proofErr w:type="gramStart"/>
+      <w:r>
+        <w:t>s.draw</w:t>
+      </w:r>
+      <w:proofErr w:type="spellEnd"/>
+      <w:proofErr w:type="gramEnd"/>
+      <w:r>
+        <w:t>();</w:t>
+      </w:r>
+    </w:p>
+    <w:p/>
+    <w:p>
+      <w:r>
+        <w:t xml:space="preserve">        s = new </w:t>
+      </w:r>
+      <w:proofErr w:type="gramStart"/>
+      <w:r>
+        <w:t>Circle(</w:t>
+      </w:r>
+      <w:proofErr w:type="gramEnd"/>
+      <w:r>
+        <w:t>);</w:t>
+      </w:r>
+    </w:p>
+    <w:p>
+      <w:r>
+        <w:t xml:space="preserve">        </w:t>
+      </w:r>
+      <w:proofErr w:type="spellStart"/>
+      <w:proofErr w:type="gramStart"/>
+      <w:r>
+        <w:t>s.draw</w:t>
+      </w:r>
+      <w:proofErr w:type="spellEnd"/>
+      <w:proofErr w:type="gramEnd"/>
+      <w:r>
+        <w:t>();</w:t>
+      </w:r>
+    </w:p>
+    <w:p/>
+    <w:p>
+      <w:r>
+        <w:t xml:space="preserve">        s = new </w:t>
+      </w:r>
+      <w:proofErr w:type="gramStart"/>
+      <w:r>
+        <w:t>Triangle(</w:t>
+      </w:r>
+      <w:proofErr w:type="gramEnd"/>
+      <w:r>
+        <w:t>);</w:t>
+      </w:r>
+    </w:p>
+    <w:p>
+      <w:r>
+        <w:t xml:space="preserve">        </w:t>
+      </w:r>
+      <w:proofErr w:type="spellStart"/>
+      <w:proofErr w:type="gramStart"/>
+      <w:r>
+        <w:t>s.draw</w:t>
+      </w:r>
+      <w:proofErr w:type="spellEnd"/>
+      <w:proofErr w:type="gramEnd"/>
+      <w:r>
+        <w:t>();</w:t>
+      </w:r>
+    </w:p>
+    <w:p>
+      <w:r>
+        <w:t xml:space="preserve">    }</w:t>
+      </w:r>
+    </w:p>
+    <w:p>
+      <w:r>
+        <w:t>}</w:t>
+      </w:r>
+    </w:p>
+    <w:p>
+      <w:pPr>
+        <w:jc w:val="both"/>
+      </w:pPr>
     </w:p>
     <w:sectPr>
       <w:pgSz w:w="12240" w:h="15840"/>
@@ -8927,7 +11893,7 @@
 </file>
 
 <file path=word/numbering.xml><?xml version="1.0" encoding="utf-8"?>
-<w:numbering xmlns:wpc="http://schemas.microsoft.com/office/word/2010/wordprocessingCanvas" xmlns:cx="http://schemas.microsoft.com/office/drawing/2014/chartex" xmlns:cx1="http://schemas.microsoft.com/office/drawing/2015/9/8/chartex" xmlns:cx2="http://schemas.microsoft.com/office/drawing/2015/10/21/chartex" xmlns:cx3="http://schemas.microsoft.com/office/drawing/2016/5/9/chartex" xmlns:cx4="http://schemas.microsoft.com/office/drawing/2016/5/10/chartex" xmlns:cx5="http://schemas.microsoft.com/office/drawing/2016/5/11/chartex" xmlns:cx6="http://schemas.microsoft.com/office/drawing/2016/5/12/chartex" xmlns:cx7="http://schemas.microsoft.com/office/drawing/2016/5/13/chartex" xmlns:cx8="http://schemas.microsoft.com/office/drawing/2016/5/14/chartex" xmlns:mc="http://schemas.openxmlformats.org/markup-compatibility/2006" xmlns:aink="http://schemas.microsoft.com/office/drawing/2016/ink" xmlns:am3d="http://schemas.microsoft.com/office/drawing/2017/model3d" xmlns:o="urn:schemas-microsoft-com:office:office" xmlns:oel="http://schemas.microsoft.com/office/2019/extlst" xmlns:r="http://schemas.openxmlformats.org/officeDocument/2006/relationships" xmlns:m="http://schemas.openxmlformats.org/officeDocument/2006/math" xmlns:v="urn:schemas-microsoft-com:vml" xmlns:wp14="http://schemas.microsoft.com/office/word/2010/wordprocessingDrawing" xmlns:wp="http://schemas.openxmlformats.org/drawingml/2006/wordprocessingDrawing" xmlns:w10="urn:schemas-microsoft-com:office:word" xmlns:w="http://schemas.openxmlformats.org/wordprocessingml/2006/main" xmlns:w14="http://schemas.microsoft.com/office/word/2010/wordml" xmlns:w15="http://schemas.microsoft.com/office/word/2012/wordml" xmlns:w16cei="http://schemas.microsoft.com/office/word/2026/wordml/cei" xmlns:w16cex="http://schemas.microsoft.com/office/word/2018/wordml/cex" xmlns:w16cid="http://schemas.microsoft.com/office/word/2016/wordml/cid" xmlns:w16="http://schemas.microsoft.com/office/word/2018/wordml" xmlns:w16du="http://schemas.microsoft.com/office/word/2023/wordml/word16du" xmlns:w16sdtdh="http://schemas.microsoft.com/office/word/2020/wordml/sdtdatahash" xmlns:w16sdtfl="http://schemas.microsoft.com/office/word/2024/wordml/sdtformatlock" xmlns:w16se="http://schemas.microsoft.com/office/word/2015/wordml/symex" xmlns:wpg="http://schemas.microsoft.com/office/word/2010/wordprocessingGroup" xmlns:wpi="http://schemas.microsoft.com/office/word/2010/wordprocessingInk" xmlns:wne="http://schemas.microsoft.com/office/word/2006/wordml" xmlns:wps="http://schemas.microsoft.com/office/word/2010/wordprocessingShape" mc:Ignorable="w14 w15 w16se w16cid w16 w16cex w16sdtdh w16sdtfl w16du wp14">
+<w:numbering xmlns:wpc="http://schemas.microsoft.com/office/word/2010/wordprocessingCanvas" xmlns:cx="http://schemas.microsoft.com/office/drawing/2014/chartex" xmlns:cx1="http://schemas.microsoft.com/office/drawing/2015/9/8/chartex" xmlns:cx2="http://schemas.microsoft.com/office/drawing/2015/10/21/chartex" xmlns:cx3="http://schemas.microsoft.com/office/drawing/2016/5/9/chartex" xmlns:cx4="http://schemas.microsoft.com/office/drawing/2016/5/10/chartex" xmlns:cx5="http://schemas.microsoft.com/office/drawing/2016/5/11/chartex" xmlns:cx6="http://schemas.microsoft.com/office/drawing/2016/5/12/chartex" xmlns:cx7="http://schemas.microsoft.com/office/drawing/2016/5/13/chartex" xmlns:cx8="http://schemas.microsoft.com/office/drawing/2016/5/14/chartex" xmlns:mc="http://schemas.openxmlformats.org/markup-compatibility/2006" xmlns:aink="http://schemas.microsoft.com/office/drawing/2016/ink" xmlns:am3d="http://schemas.microsoft.com/office/drawing/2017/model3d" xmlns:o="urn:schemas-microsoft-com:office:office" xmlns:oel="http://schemas.microsoft.com/office/2019/extlst" xmlns:r="http://schemas.openxmlformats.org/officeDocument/2006/relationships" xmlns:m="http://schemas.openxmlformats.org/officeDocument/2006/math" xmlns:v="urn:schemas-microsoft-com:vml" xmlns:wp14="http://schemas.microsoft.com/office/word/2010/wordprocessingDrawing" xmlns:wp="http://schemas.openxmlformats.org/drawingml/2006/wordprocessingDrawing" xmlns:w10="urn:schemas-microsoft-com:office:word" xmlns:w="http://schemas.openxmlformats.org/wordprocessingml/2006/main" xmlns:w14="http://schemas.microsoft.com/office/word/2010/wordml" xmlns:w15="http://schemas.microsoft.com/office/word/2012/wordml" xmlns:w16cex="http://schemas.microsoft.com/office/word/2018/wordml/cex" xmlns:w16cid="http://schemas.microsoft.com/office/word/2016/wordml/cid" xmlns:w16="http://schemas.microsoft.com/office/word/2018/wordml" xmlns:w16du="http://schemas.microsoft.com/office/word/2023/wordml/word16du" xmlns:w16sdtdh="http://schemas.microsoft.com/office/word/2020/wordml/sdtdatahash" xmlns:w16sdtfl="http://schemas.microsoft.com/office/word/2024/wordml/sdtformatlock" xmlns:w16se="http://schemas.microsoft.com/office/word/2015/wordml/symex" xmlns:wpg="http://schemas.microsoft.com/office/word/2010/wordprocessingGroup" xmlns:wpi="http://schemas.microsoft.com/office/word/2010/wordprocessingInk" xmlns:wne="http://schemas.microsoft.com/office/word/2006/wordml" xmlns:wps="http://schemas.microsoft.com/office/word/2010/wordprocessingShape" mc:Ignorable="w14 w15 w16se w16cid w16 w16cex w16sdtdh w16sdtfl w16du wp14">
   <w:abstractNum w:abstractNumId="0" w15:restartNumberingAfterBreak="0">
     <w:nsid w:val="08391B0D"/>
     <w:multiLevelType w:val="multilevel"/>

</xml_diff>